<commit_message>
Update lab assignments and add KnowBase prototype
</commit_message>
<xml_diff>
--- a/Лабы/Лабораторная 6.docx
+++ b/Лабы/Лабораторная 6.docx
@@ -2234,6 +2234,2432 @@
         </w:rPr>
         <w:t xml:space="preserve"> </w:t>
       </w:r>
+      <w:r>
+        <w:br w:type="page"/>
+      </w:r>
+      <w:r>
+        <w:rPr>
+          <w:rtl w:val="0"/>
+        </w:rPr>
+      </w:r>
+    </w:p>
+    <w:p>
+      <w:pPr>
+        <w:pStyle w:val="Heading1"/>
+        <w:keepNext w:val="0"/>
+        <w:keepLines w:val="0"/>
+        <w:pBdr>
+          <w:top w:color="auto" w:space="0" w:sz="0" w:val="none"/>
+          <w:left w:color="auto" w:space="0" w:sz="0" w:val="none"/>
+          <w:bottom w:color="auto" w:space="0" w:sz="0" w:val="none"/>
+          <w:right w:color="auto" w:space="0" w:sz="0" w:val="none"/>
+          <w:between w:color="auto" w:space="0" w:sz="0" w:val="none"/>
+        </w:pBdr>
+        <w:spacing w:after="0" w:before="460" w:line="300" w:lineRule="auto"/>
+        <w:rPr>
+          <w:rFonts w:ascii="Roboto" w:cs="Roboto" w:eastAsia="Roboto" w:hAnsi="Roboto"/>
+          <w:color w:val="172b4d"/>
+          <w:sz w:val="36"/>
+          <w:szCs w:val="36"/>
+        </w:rPr>
+      </w:pPr>
+      <w:bookmarkStart w:colFirst="0" w:colLast="0" w:name="_uhvszecj6g95" w:id="0"/>
+      <w:bookmarkEnd w:id="0"/>
+      <w:r>
+        <w:rPr>
+          <w:rFonts w:ascii="Roboto" w:cs="Roboto" w:eastAsia="Roboto" w:hAnsi="Roboto"/>
+          <w:color w:val="172b4d"/>
+          <w:sz w:val="36"/>
+          <w:szCs w:val="36"/>
+          <w:rtl w:val="0"/>
+        </w:rPr>
+        <w:t xml:space="preserve">Приложение А. Техническое задание для анализа</w:t>
+      </w:r>
+    </w:p>
+    <w:tbl>
+      <w:tblPr>
+        <w:tblStyle w:val="Table4"/>
+        <w:tblW w:w="6285.0" w:type="dxa"/>
+        <w:jc w:val="left"/>
+        <w:tblBorders>
+          <w:top w:color="000000" w:space="0" w:sz="0" w:val="nil"/>
+          <w:left w:color="000000" w:space="0" w:sz="0" w:val="nil"/>
+          <w:bottom w:color="000000" w:space="0" w:sz="0" w:val="nil"/>
+          <w:right w:color="000000" w:space="0" w:sz="0" w:val="nil"/>
+          <w:insideH w:color="000000" w:space="0" w:sz="0" w:val="nil"/>
+          <w:insideV w:color="000000" w:space="0" w:sz="0" w:val="nil"/>
+        </w:tblBorders>
+        <w:tblLayout w:type="fixed"/>
+        <w:tblLook w:val="0600"/>
+      </w:tblPr>
+      <w:tblGrid>
+        <w:gridCol w:w="6285"/>
+        <w:tblGridChange w:id="0">
+          <w:tblGrid>
+            <w:gridCol w:w="6285"/>
+          </w:tblGrid>
+        </w:tblGridChange>
+      </w:tblGrid>
+      <w:tr>
+        <w:trPr>
+          <w:cantSplit w:val="0"/>
+          <w:trHeight w:val="1815" w:hRule="atLeast"/>
+          <w:tblHeader w:val="0"/>
+        </w:trPr>
+        <w:tc>
+          <w:tcPr>
+            <w:tcBorders>
+              <w:top w:color="c1c7d0" w:space="0" w:sz="6" w:val="single"/>
+              <w:left w:color="c1c7d0" w:space="0" w:sz="6" w:val="single"/>
+              <w:bottom w:color="c1c7d0" w:space="0" w:sz="6" w:val="single"/>
+              <w:right w:color="c1c7d0" w:space="0" w:sz="6" w:val="single"/>
+            </w:tcBorders>
+            <w:tcMar>
+              <w:top w:w="100.0" w:type="dxa"/>
+              <w:left w:w="160.0" w:type="dxa"/>
+              <w:bottom w:w="100.0" w:type="dxa"/>
+              <w:right w:w="160.0" w:type="dxa"/>
+            </w:tcMar>
+            <w:vAlign w:val="top"/>
+          </w:tcPr>
+          <w:p>
+            <w:pPr>
+              <w:pBdr>
+                <w:top w:color="auto" w:space="0" w:sz="0" w:val="none"/>
+                <w:left w:color="auto" w:space="0" w:sz="0" w:val="none"/>
+                <w:bottom w:color="auto" w:space="0" w:sz="0" w:val="none"/>
+                <w:right w:color="auto" w:space="0" w:sz="0" w:val="none"/>
+                <w:between w:color="auto" w:space="0" w:sz="0" w:val="none"/>
+              </w:pBdr>
+              <w:spacing w:before="160" w:lineRule="auto"/>
+              <w:rPr>
+                <w:rFonts w:ascii="Roboto" w:cs="Roboto" w:eastAsia="Roboto" w:hAnsi="Roboto"/>
+                <w:b w:val="1"/>
+                <w:bCs w:val="1"/>
+                <w:color w:val="172b4d"/>
+                <w:sz w:val="21"/>
+                <w:szCs w:val="21"/>
+              </w:rPr>
+            </w:pPr>
+            <w:r>
+              <w:rPr>
+                <w:rFonts w:ascii="Roboto" w:cs="Roboto" w:eastAsia="Roboto" w:hAnsi="Roboto"/>
+                <w:b w:val="1"/>
+                <w:bCs w:val="1"/>
+                <w:color w:val="172b4d"/>
+                <w:sz w:val="21"/>
+                <w:szCs w:val="21"/>
+                <w:rtl w:val="0"/>
+              </w:rPr>
+              <w:t xml:space="preserve">ТЕХНИЧЕСКОЕ ЗАДАНИЕ</w:t>
+            </w:r>
+          </w:p>
+          <w:p>
+            <w:pPr>
+              <w:pBdr>
+                <w:top w:color="auto" w:space="0" w:sz="0" w:val="none"/>
+                <w:left w:color="auto" w:space="0" w:sz="0" w:val="none"/>
+                <w:bottom w:color="auto" w:space="0" w:sz="0" w:val="none"/>
+                <w:right w:color="auto" w:space="0" w:sz="0" w:val="none"/>
+                <w:between w:color="auto" w:space="0" w:sz="0" w:val="none"/>
+              </w:pBdr>
+              <w:spacing w:before="320" w:lineRule="auto"/>
+              <w:rPr>
+                <w:rFonts w:ascii="Roboto" w:cs="Roboto" w:eastAsia="Roboto" w:hAnsi="Roboto"/>
+                <w:b w:val="1"/>
+                <w:bCs w:val="1"/>
+                <w:color w:val="172b4d"/>
+                <w:sz w:val="21"/>
+                <w:szCs w:val="21"/>
+              </w:rPr>
+            </w:pPr>
+            <w:r>
+              <w:rPr>
+                <w:rFonts w:ascii="Roboto" w:cs="Roboto" w:eastAsia="Roboto" w:hAnsi="Roboto"/>
+                <w:b w:val="1"/>
+                <w:bCs w:val="1"/>
+                <w:color w:val="172b4d"/>
+                <w:sz w:val="21"/>
+                <w:szCs w:val="21"/>
+                <w:rtl w:val="0"/>
+              </w:rPr>
+              <w:t xml:space="preserve">Система управления задачами «TaskFlow»</w:t>
+            </w:r>
+          </w:p>
+          <w:p>
+            <w:pPr>
+              <w:pBdr>
+                <w:top w:color="auto" w:space="0" w:sz="0" w:val="none"/>
+                <w:left w:color="auto" w:space="0" w:sz="0" w:val="none"/>
+                <w:bottom w:color="auto" w:space="0" w:sz="0" w:val="none"/>
+                <w:right w:color="auto" w:space="0" w:sz="0" w:val="none"/>
+                <w:between w:color="auto" w:space="0" w:sz="0" w:val="none"/>
+              </w:pBdr>
+              <w:spacing w:before="320" w:lineRule="auto"/>
+              <w:rPr>
+                <w:rFonts w:ascii="Roboto" w:cs="Roboto" w:eastAsia="Roboto" w:hAnsi="Roboto"/>
+                <w:color w:val="172b4d"/>
+                <w:sz w:val="21"/>
+                <w:szCs w:val="21"/>
+              </w:rPr>
+            </w:pPr>
+            <w:r>
+              <w:rPr>
+                <w:rFonts w:ascii="Roboto" w:cs="Roboto" w:eastAsia="Roboto" w:hAnsi="Roboto"/>
+                <w:color w:val="172b4d"/>
+                <w:sz w:val="21"/>
+                <w:szCs w:val="21"/>
+                <w:rtl w:val="0"/>
+              </w:rPr>
+              <w:t xml:space="preserve">Модуль управления задачами и проектами</w:t>
+            </w:r>
+          </w:p>
+          <w:p>
+            <w:pPr>
+              <w:pBdr>
+                <w:top w:color="auto" w:space="0" w:sz="0" w:val="none"/>
+                <w:left w:color="auto" w:space="0" w:sz="0" w:val="none"/>
+                <w:bottom w:color="auto" w:space="0" w:sz="0" w:val="none"/>
+                <w:right w:color="auto" w:space="0" w:sz="0" w:val="none"/>
+                <w:between w:color="auto" w:space="0" w:sz="0" w:val="none"/>
+              </w:pBdr>
+              <w:spacing w:before="320" w:lineRule="auto"/>
+              <w:rPr>
+                <w:rFonts w:ascii="Roboto" w:cs="Roboto" w:eastAsia="Roboto" w:hAnsi="Roboto"/>
+                <w:i w:val="1"/>
+                <w:iCs w:val="1"/>
+                <w:color w:val="172b4d"/>
+                <w:sz w:val="21"/>
+                <w:szCs w:val="21"/>
+              </w:rPr>
+            </w:pPr>
+            <w:r>
+              <w:rPr>
+                <w:rFonts w:ascii="Roboto" w:cs="Roboto" w:eastAsia="Roboto" w:hAnsi="Roboto"/>
+                <w:i w:val="1"/>
+                <w:iCs w:val="1"/>
+                <w:color w:val="172b4d"/>
+                <w:sz w:val="21"/>
+                <w:szCs w:val="21"/>
+                <w:rtl w:val="0"/>
+              </w:rPr>
+              <w:t xml:space="preserve">Версия документа: 1.2</w:t>
+              <w:tab/>
+              <w:t xml:space="preserve">|</w:t>
+              <w:tab/>
+              <w:t xml:space="preserve">Статус: На согласовании</w:t>
+            </w:r>
+          </w:p>
+        </w:tc>
+      </w:tr>
+    </w:tbl>
+    <w:p>
+      <w:pPr>
+        <w:pBdr>
+          <w:top w:color="auto" w:space="0" w:sz="0" w:val="none"/>
+          <w:left w:color="auto" w:space="0" w:sz="0" w:val="none"/>
+          <w:bottom w:color="auto" w:space="0" w:sz="0" w:val="none"/>
+          <w:right w:color="auto" w:space="0" w:sz="0" w:val="none"/>
+          <w:between w:color="auto" w:space="0" w:sz="0" w:val="none"/>
+        </w:pBdr>
+        <w:spacing w:before="160" w:lineRule="auto"/>
+        <w:rPr>
+          <w:rFonts w:ascii="Roboto" w:cs="Roboto" w:eastAsia="Roboto" w:hAnsi="Roboto"/>
+          <w:b w:val="1"/>
+          <w:bCs w:val="1"/>
+          <w:color w:val="172b4d"/>
+          <w:sz w:val="21"/>
+          <w:szCs w:val="21"/>
+        </w:rPr>
+      </w:pPr>
+      <w:r>
+        <w:rPr>
+          <w:rFonts w:ascii="Roboto" w:cs="Roboto" w:eastAsia="Roboto" w:hAnsi="Roboto"/>
+          <w:b w:val="1"/>
+          <w:bCs w:val="1"/>
+          <w:color w:val="172b4d"/>
+          <w:sz w:val="21"/>
+          <w:szCs w:val="21"/>
+          <w:rtl w:val="0"/>
+        </w:rPr>
+        <w:t xml:space="preserve">1. Общие положения</w:t>
+      </w:r>
+    </w:p>
+    <w:p>
+      <w:pPr>
+        <w:pBdr>
+          <w:top w:color="auto" w:space="0" w:sz="0" w:val="none"/>
+          <w:left w:color="auto" w:space="0" w:sz="0" w:val="none"/>
+          <w:bottom w:color="auto" w:space="0" w:sz="0" w:val="none"/>
+          <w:right w:color="auto" w:space="0" w:sz="0" w:val="none"/>
+          <w:between w:color="auto" w:space="0" w:sz="0" w:val="none"/>
+        </w:pBdr>
+        <w:spacing w:before="160" w:lineRule="auto"/>
+        <w:rPr>
+          <w:rFonts w:ascii="Roboto" w:cs="Roboto" w:eastAsia="Roboto" w:hAnsi="Roboto"/>
+          <w:b w:val="1"/>
+          <w:bCs w:val="1"/>
+          <w:color w:val="172b4d"/>
+          <w:sz w:val="21"/>
+          <w:szCs w:val="21"/>
+        </w:rPr>
+      </w:pPr>
+      <w:r>
+        <w:rPr>
+          <w:rFonts w:ascii="Roboto" w:cs="Roboto" w:eastAsia="Roboto" w:hAnsi="Roboto"/>
+          <w:b w:val="1"/>
+          <w:bCs w:val="1"/>
+          <w:color w:val="172b4d"/>
+          <w:sz w:val="21"/>
+          <w:szCs w:val="21"/>
+          <w:rtl w:val="0"/>
+        </w:rPr>
+        <w:t xml:space="preserve">1.1. Назначение системы</w:t>
+      </w:r>
+    </w:p>
+    <w:p>
+      <w:pPr>
+        <w:pBdr>
+          <w:top w:color="auto" w:space="0" w:sz="0" w:val="none"/>
+          <w:left w:color="auto" w:space="0" w:sz="0" w:val="none"/>
+          <w:bottom w:color="auto" w:space="0" w:sz="0" w:val="none"/>
+          <w:right w:color="auto" w:space="0" w:sz="0" w:val="none"/>
+          <w:between w:color="auto" w:space="0" w:sz="0" w:val="none"/>
+        </w:pBdr>
+        <w:spacing w:before="160" w:lineRule="auto"/>
+        <w:rPr>
+          <w:rFonts w:ascii="Roboto" w:cs="Roboto" w:eastAsia="Roboto" w:hAnsi="Roboto"/>
+          <w:color w:val="172b4d"/>
+          <w:sz w:val="21"/>
+          <w:szCs w:val="21"/>
+        </w:rPr>
+      </w:pPr>
+      <w:r>
+        <w:rPr>
+          <w:rFonts w:ascii="Roboto" w:cs="Roboto" w:eastAsia="Roboto" w:hAnsi="Roboto"/>
+          <w:color w:val="172b4d"/>
+          <w:sz w:val="21"/>
+          <w:szCs w:val="21"/>
+          <w:rtl w:val="0"/>
+        </w:rPr>
+        <w:t xml:space="preserve">Система TaskFlow предназначена для управления задачами, проектами и командной работой в организациях с численностью сотрудников от 10 до 10 000 человек.</w:t>
+      </w:r>
+    </w:p>
+    <w:p>
+      <w:pPr>
+        <w:pBdr>
+          <w:top w:color="auto" w:space="0" w:sz="0" w:val="none"/>
+          <w:left w:color="auto" w:space="0" w:sz="0" w:val="none"/>
+          <w:bottom w:color="auto" w:space="0" w:sz="0" w:val="none"/>
+          <w:right w:color="auto" w:space="0" w:sz="0" w:val="none"/>
+          <w:between w:color="auto" w:space="0" w:sz="0" w:val="none"/>
+        </w:pBdr>
+        <w:spacing w:before="160" w:lineRule="auto"/>
+        <w:rPr>
+          <w:rFonts w:ascii="Roboto" w:cs="Roboto" w:eastAsia="Roboto" w:hAnsi="Roboto"/>
+          <w:b w:val="1"/>
+          <w:bCs w:val="1"/>
+          <w:color w:val="172b4d"/>
+          <w:sz w:val="21"/>
+          <w:szCs w:val="21"/>
+        </w:rPr>
+      </w:pPr>
+      <w:r>
+        <w:rPr>
+          <w:rFonts w:ascii="Roboto" w:cs="Roboto" w:eastAsia="Roboto" w:hAnsi="Roboto"/>
+          <w:b w:val="1"/>
+          <w:bCs w:val="1"/>
+          <w:color w:val="172b4d"/>
+          <w:sz w:val="21"/>
+          <w:szCs w:val="21"/>
+          <w:rtl w:val="0"/>
+        </w:rPr>
+        <w:t xml:space="preserve">1.2. Пользователи системы</w:t>
+      </w:r>
+    </w:p>
+    <w:p>
+      <w:pPr>
+        <w:pBdr>
+          <w:top w:color="auto" w:space="0" w:sz="0" w:val="none"/>
+          <w:left w:color="auto" w:space="0" w:sz="0" w:val="none"/>
+          <w:bottom w:color="auto" w:space="0" w:sz="0" w:val="none"/>
+          <w:right w:color="auto" w:space="0" w:sz="0" w:val="none"/>
+          <w:between w:color="auto" w:space="0" w:sz="0" w:val="none"/>
+        </w:pBdr>
+        <w:spacing w:before="160" w:lineRule="auto"/>
+        <w:rPr>
+          <w:rFonts w:ascii="Roboto" w:cs="Roboto" w:eastAsia="Roboto" w:hAnsi="Roboto"/>
+          <w:color w:val="172b4d"/>
+          <w:sz w:val="21"/>
+          <w:szCs w:val="21"/>
+        </w:rPr>
+      </w:pPr>
+      <w:r>
+        <w:rPr>
+          <w:rFonts w:ascii="Roboto" w:cs="Roboto" w:eastAsia="Roboto" w:hAnsi="Roboto"/>
+          <w:color w:val="172b4d"/>
+          <w:sz w:val="21"/>
+          <w:szCs w:val="21"/>
+          <w:rtl w:val="0"/>
+        </w:rPr>
+        <w:t xml:space="preserve">Система предусматривает три роли пользователей:</w:t>
+      </w:r>
+    </w:p>
+    <w:p>
+      <w:pPr>
+        <w:numPr>
+          <w:ilvl w:val="0"/>
+          <w:numId w:val="1"/>
+        </w:numPr>
+        <w:spacing w:after="0" w:afterAutospacing="0" w:before="160" w:lineRule="auto"/>
+        <w:ind w:left="720" w:hanging="360"/>
+      </w:pPr>
+      <w:r>
+        <w:rPr>
+          <w:rFonts w:ascii="Roboto" w:cs="Roboto" w:eastAsia="Roboto" w:hAnsi="Roboto"/>
+          <w:color w:val="172b4d"/>
+          <w:sz w:val="21"/>
+          <w:szCs w:val="21"/>
+          <w:rtl w:val="0"/>
+        </w:rPr>
+        <w:t xml:space="preserve">Администратор - управляет пользователями, ролями и настройками системы.</w:t>
+      </w:r>
+    </w:p>
+    <w:p>
+      <w:pPr>
+        <w:numPr>
+          <w:ilvl w:val="0"/>
+          <w:numId w:val="1"/>
+        </w:numPr>
+        <w:spacing w:after="0" w:afterAutospacing="0" w:before="0" w:beforeAutospacing="0" w:lineRule="auto"/>
+        <w:ind w:left="720" w:hanging="360"/>
+      </w:pPr>
+      <w:r>
+        <w:rPr>
+          <w:rFonts w:ascii="Roboto" w:cs="Roboto" w:eastAsia="Roboto" w:hAnsi="Roboto"/>
+          <w:color w:val="172b4d"/>
+          <w:sz w:val="21"/>
+          <w:szCs w:val="21"/>
+          <w:rtl w:val="0"/>
+        </w:rPr>
+        <w:t xml:space="preserve">Менеджер - создаёт проекты, назначает задачи, формирует отчёты.</w:t>
+      </w:r>
+    </w:p>
+    <w:p>
+      <w:pPr>
+        <w:numPr>
+          <w:ilvl w:val="0"/>
+          <w:numId w:val="1"/>
+        </w:numPr>
+        <w:spacing w:before="0" w:beforeAutospacing="0" w:lineRule="auto"/>
+        <w:ind w:left="720" w:hanging="360"/>
+      </w:pPr>
+      <w:r>
+        <w:rPr>
+          <w:rFonts w:ascii="Roboto" w:cs="Roboto" w:eastAsia="Roboto" w:hAnsi="Roboto"/>
+          <w:color w:val="172b4d"/>
+          <w:sz w:val="21"/>
+          <w:szCs w:val="21"/>
+          <w:rtl w:val="0"/>
+        </w:rPr>
+        <w:t xml:space="preserve">Исполнитель - работает с назначенными задачами.</w:t>
+      </w:r>
+    </w:p>
+    <w:p>
+      <w:pPr>
+        <w:pBdr>
+          <w:top w:color="auto" w:space="0" w:sz="0" w:val="none"/>
+          <w:left w:color="auto" w:space="0" w:sz="0" w:val="none"/>
+          <w:bottom w:color="auto" w:space="0" w:sz="0" w:val="none"/>
+          <w:right w:color="auto" w:space="0" w:sz="0" w:val="none"/>
+          <w:between w:color="auto" w:space="0" w:sz="0" w:val="none"/>
+        </w:pBdr>
+        <w:spacing w:before="160" w:lineRule="auto"/>
+        <w:rPr>
+          <w:rFonts w:ascii="Roboto" w:cs="Roboto" w:eastAsia="Roboto" w:hAnsi="Roboto"/>
+          <w:b w:val="1"/>
+          <w:bCs w:val="1"/>
+          <w:color w:val="172b4d"/>
+          <w:sz w:val="21"/>
+          <w:szCs w:val="21"/>
+        </w:rPr>
+      </w:pPr>
+      <w:r>
+        <w:rPr>
+          <w:rFonts w:ascii="Roboto" w:cs="Roboto" w:eastAsia="Roboto" w:hAnsi="Roboto"/>
+          <w:b w:val="1"/>
+          <w:bCs w:val="1"/>
+          <w:color w:val="172b4d"/>
+          <w:sz w:val="21"/>
+          <w:szCs w:val="21"/>
+          <w:rtl w:val="0"/>
+        </w:rPr>
+        <w:t xml:space="preserve">1.3. Технические ограничения</w:t>
+      </w:r>
+    </w:p>
+    <w:p>
+      <w:pPr>
+        <w:pBdr>
+          <w:top w:color="auto" w:space="0" w:sz="0" w:val="none"/>
+          <w:left w:color="auto" w:space="0" w:sz="0" w:val="none"/>
+          <w:bottom w:color="auto" w:space="0" w:sz="0" w:val="none"/>
+          <w:right w:color="auto" w:space="0" w:sz="0" w:val="none"/>
+          <w:between w:color="auto" w:space="0" w:sz="0" w:val="none"/>
+        </w:pBdr>
+        <w:spacing w:before="160" w:lineRule="auto"/>
+        <w:rPr>
+          <w:rFonts w:ascii="Roboto" w:cs="Roboto" w:eastAsia="Roboto" w:hAnsi="Roboto"/>
+          <w:color w:val="172b4d"/>
+          <w:sz w:val="21"/>
+          <w:szCs w:val="21"/>
+        </w:rPr>
+      </w:pPr>
+      <w:r>
+        <w:rPr>
+          <w:rFonts w:ascii="Roboto" w:cs="Roboto" w:eastAsia="Roboto" w:hAnsi="Roboto"/>
+          <w:color w:val="172b4d"/>
+          <w:sz w:val="21"/>
+          <w:szCs w:val="21"/>
+          <w:rtl w:val="0"/>
+        </w:rPr>
+        <w:t xml:space="preserve">Система должна работать в браузерах Chrome, Firefox и Safari. Поддержка мобильных устройств будет реализована в следующей версии.</w:t>
+      </w:r>
+    </w:p>
+    <w:p>
+      <w:pPr>
+        <w:pBdr>
+          <w:top w:color="auto" w:space="0" w:sz="0" w:val="none"/>
+          <w:left w:color="auto" w:space="0" w:sz="0" w:val="none"/>
+          <w:bottom w:color="auto" w:space="0" w:sz="0" w:val="none"/>
+          <w:right w:color="auto" w:space="0" w:sz="0" w:val="none"/>
+          <w:between w:color="auto" w:space="0" w:sz="0" w:val="none"/>
+        </w:pBdr>
+        <w:spacing w:before="160" w:lineRule="auto"/>
+        <w:rPr>
+          <w:rFonts w:ascii="Roboto" w:cs="Roboto" w:eastAsia="Roboto" w:hAnsi="Roboto"/>
+          <w:b w:val="1"/>
+          <w:bCs w:val="1"/>
+          <w:color w:val="172b4d"/>
+          <w:sz w:val="21"/>
+          <w:szCs w:val="21"/>
+        </w:rPr>
+      </w:pPr>
+      <w:r>
+        <w:rPr>
+          <w:rFonts w:ascii="Roboto" w:cs="Roboto" w:eastAsia="Roboto" w:hAnsi="Roboto"/>
+          <w:b w:val="1"/>
+          <w:bCs w:val="1"/>
+          <w:color w:val="172b4d"/>
+          <w:sz w:val="21"/>
+          <w:szCs w:val="21"/>
+          <w:rtl w:val="0"/>
+        </w:rPr>
+        <w:t xml:space="preserve">2. Управление задачами</w:t>
+      </w:r>
+    </w:p>
+    <w:p>
+      <w:pPr>
+        <w:pBdr>
+          <w:top w:color="auto" w:space="0" w:sz="0" w:val="none"/>
+          <w:left w:color="auto" w:space="0" w:sz="0" w:val="none"/>
+          <w:bottom w:color="auto" w:space="0" w:sz="0" w:val="none"/>
+          <w:right w:color="auto" w:space="0" w:sz="0" w:val="none"/>
+          <w:between w:color="auto" w:space="0" w:sz="0" w:val="none"/>
+        </w:pBdr>
+        <w:spacing w:before="160" w:lineRule="auto"/>
+        <w:rPr>
+          <w:rFonts w:ascii="Roboto" w:cs="Roboto" w:eastAsia="Roboto" w:hAnsi="Roboto"/>
+          <w:b w:val="1"/>
+          <w:bCs w:val="1"/>
+          <w:color w:val="172b4d"/>
+          <w:sz w:val="21"/>
+          <w:szCs w:val="21"/>
+        </w:rPr>
+      </w:pPr>
+      <w:r>
+        <w:rPr>
+          <w:rFonts w:ascii="Roboto" w:cs="Roboto" w:eastAsia="Roboto" w:hAnsi="Roboto"/>
+          <w:b w:val="1"/>
+          <w:bCs w:val="1"/>
+          <w:color w:val="172b4d"/>
+          <w:sz w:val="21"/>
+          <w:szCs w:val="21"/>
+          <w:rtl w:val="0"/>
+        </w:rPr>
+        <w:t xml:space="preserve">2.1. Создание задачи</w:t>
+      </w:r>
+    </w:p>
+    <w:p>
+      <w:pPr>
+        <w:pBdr>
+          <w:top w:color="auto" w:space="0" w:sz="0" w:val="none"/>
+          <w:left w:color="auto" w:space="0" w:sz="0" w:val="none"/>
+          <w:bottom w:color="auto" w:space="0" w:sz="0" w:val="none"/>
+          <w:right w:color="auto" w:space="0" w:sz="0" w:val="none"/>
+          <w:between w:color="auto" w:space="0" w:sz="0" w:val="none"/>
+        </w:pBdr>
+        <w:spacing w:before="160" w:lineRule="auto"/>
+        <w:rPr>
+          <w:rFonts w:ascii="Roboto" w:cs="Roboto" w:eastAsia="Roboto" w:hAnsi="Roboto"/>
+          <w:color w:val="172b4d"/>
+          <w:sz w:val="21"/>
+          <w:szCs w:val="21"/>
+        </w:rPr>
+      </w:pPr>
+      <w:r>
+        <w:rPr>
+          <w:rFonts w:ascii="Roboto" w:cs="Roboto" w:eastAsia="Roboto" w:hAnsi="Roboto"/>
+          <w:color w:val="172b4d"/>
+          <w:sz w:val="21"/>
+          <w:szCs w:val="21"/>
+          <w:rtl w:val="0"/>
+        </w:rPr>
+        <w:t xml:space="preserve">2.1.1. Менеджер и исполнитель могут создавать задачи в проекте.</w:t>
+      </w:r>
+    </w:p>
+    <w:p>
+      <w:pPr>
+        <w:pBdr>
+          <w:top w:color="auto" w:space="0" w:sz="0" w:val="none"/>
+          <w:left w:color="auto" w:space="0" w:sz="0" w:val="none"/>
+          <w:bottom w:color="auto" w:space="0" w:sz="0" w:val="none"/>
+          <w:right w:color="auto" w:space="0" w:sz="0" w:val="none"/>
+          <w:between w:color="auto" w:space="0" w:sz="0" w:val="none"/>
+        </w:pBdr>
+        <w:spacing w:before="160" w:lineRule="auto"/>
+        <w:rPr>
+          <w:rFonts w:ascii="Roboto" w:cs="Roboto" w:eastAsia="Roboto" w:hAnsi="Roboto"/>
+          <w:color w:val="172b4d"/>
+          <w:sz w:val="21"/>
+          <w:szCs w:val="21"/>
+        </w:rPr>
+      </w:pPr>
+      <w:r>
+        <w:rPr>
+          <w:rFonts w:ascii="Roboto" w:cs="Roboto" w:eastAsia="Roboto" w:hAnsi="Roboto"/>
+          <w:color w:val="172b4d"/>
+          <w:sz w:val="21"/>
+          <w:szCs w:val="21"/>
+          <w:rtl w:val="0"/>
+        </w:rPr>
+        <w:t xml:space="preserve">2.1.2. Задача должна содержать: название, описание, исполнителя, срок выполнения.</w:t>
+      </w:r>
+    </w:p>
+    <w:p>
+      <w:pPr>
+        <w:pBdr>
+          <w:top w:color="auto" w:space="0" w:sz="0" w:val="none"/>
+          <w:left w:color="auto" w:space="0" w:sz="0" w:val="none"/>
+          <w:bottom w:color="auto" w:space="0" w:sz="0" w:val="none"/>
+          <w:right w:color="auto" w:space="0" w:sz="0" w:val="none"/>
+          <w:between w:color="auto" w:space="0" w:sz="0" w:val="none"/>
+        </w:pBdr>
+        <w:spacing w:before="160" w:lineRule="auto"/>
+        <w:rPr>
+          <w:rFonts w:ascii="Roboto" w:cs="Roboto" w:eastAsia="Roboto" w:hAnsi="Roboto"/>
+          <w:color w:val="172b4d"/>
+          <w:sz w:val="21"/>
+          <w:szCs w:val="21"/>
+        </w:rPr>
+      </w:pPr>
+      <w:r>
+        <w:rPr>
+          <w:rFonts w:ascii="Roboto" w:cs="Roboto" w:eastAsia="Roboto" w:hAnsi="Roboto"/>
+          <w:color w:val="172b4d"/>
+          <w:sz w:val="21"/>
+          <w:szCs w:val="21"/>
+          <w:rtl w:val="0"/>
+        </w:rPr>
+        <w:t xml:space="preserve">2.1.3. Название задачи не может быть пустым.</w:t>
+      </w:r>
+    </w:p>
+    <w:p>
+      <w:pPr>
+        <w:pBdr>
+          <w:top w:color="auto" w:space="0" w:sz="0" w:val="none"/>
+          <w:left w:color="auto" w:space="0" w:sz="0" w:val="none"/>
+          <w:bottom w:color="auto" w:space="0" w:sz="0" w:val="none"/>
+          <w:right w:color="auto" w:space="0" w:sz="0" w:val="none"/>
+          <w:between w:color="auto" w:space="0" w:sz="0" w:val="none"/>
+        </w:pBdr>
+        <w:spacing w:before="160" w:lineRule="auto"/>
+        <w:rPr>
+          <w:rFonts w:ascii="Roboto" w:cs="Roboto" w:eastAsia="Roboto" w:hAnsi="Roboto"/>
+          <w:color w:val="172b4d"/>
+          <w:sz w:val="21"/>
+          <w:szCs w:val="21"/>
+        </w:rPr>
+      </w:pPr>
+      <w:r>
+        <w:rPr>
+          <w:rFonts w:ascii="Roboto" w:cs="Roboto" w:eastAsia="Roboto" w:hAnsi="Roboto"/>
+          <w:color w:val="172b4d"/>
+          <w:sz w:val="21"/>
+          <w:szCs w:val="21"/>
+          <w:rtl w:val="0"/>
+        </w:rPr>
+        <w:t xml:space="preserve">2.1.4. Срок выполнения должен быть в будущем.</w:t>
+      </w:r>
+    </w:p>
+    <w:p>
+      <w:pPr>
+        <w:pBdr>
+          <w:top w:color="auto" w:space="0" w:sz="0" w:val="none"/>
+          <w:left w:color="auto" w:space="0" w:sz="0" w:val="none"/>
+          <w:bottom w:color="auto" w:space="0" w:sz="0" w:val="none"/>
+          <w:right w:color="auto" w:space="0" w:sz="0" w:val="none"/>
+          <w:between w:color="auto" w:space="0" w:sz="0" w:val="none"/>
+        </w:pBdr>
+        <w:spacing w:before="160" w:lineRule="auto"/>
+        <w:rPr>
+          <w:rFonts w:ascii="Roboto" w:cs="Roboto" w:eastAsia="Roboto" w:hAnsi="Roboto"/>
+          <w:color w:val="172b4d"/>
+          <w:sz w:val="21"/>
+          <w:szCs w:val="21"/>
+        </w:rPr>
+      </w:pPr>
+      <w:r>
+        <w:rPr>
+          <w:rFonts w:ascii="Roboto" w:cs="Roboto" w:eastAsia="Roboto" w:hAnsi="Roboto"/>
+          <w:color w:val="172b4d"/>
+          <w:sz w:val="21"/>
+          <w:szCs w:val="21"/>
+          <w:rtl w:val="0"/>
+        </w:rPr>
+        <w:t xml:space="preserve">2.1.5. Задача считается созданной после нажатия кнопки «Сохранить».</w:t>
+      </w:r>
+    </w:p>
+    <w:p>
+      <w:pPr>
+        <w:pBdr>
+          <w:top w:color="auto" w:space="0" w:sz="0" w:val="none"/>
+          <w:left w:color="auto" w:space="0" w:sz="0" w:val="none"/>
+          <w:bottom w:color="auto" w:space="0" w:sz="0" w:val="none"/>
+          <w:right w:color="auto" w:space="0" w:sz="0" w:val="none"/>
+          <w:between w:color="auto" w:space="0" w:sz="0" w:val="none"/>
+        </w:pBdr>
+        <w:spacing w:before="160" w:lineRule="auto"/>
+        <w:rPr>
+          <w:rFonts w:ascii="Roboto" w:cs="Roboto" w:eastAsia="Roboto" w:hAnsi="Roboto"/>
+          <w:color w:val="172b4d"/>
+          <w:sz w:val="21"/>
+          <w:szCs w:val="21"/>
+        </w:rPr>
+      </w:pPr>
+      <w:r>
+        <w:rPr>
+          <w:rFonts w:ascii="Roboto" w:cs="Roboto" w:eastAsia="Roboto" w:hAnsi="Roboto"/>
+          <w:color w:val="172b4d"/>
+          <w:sz w:val="21"/>
+          <w:szCs w:val="21"/>
+          <w:rtl w:val="0"/>
+        </w:rPr>
+        <w:t xml:space="preserve">2.1.6. Исполнитель может создавать задачи только для себя.</w:t>
+      </w:r>
+    </w:p>
+    <w:p>
+      <w:pPr>
+        <w:pBdr>
+          <w:top w:color="auto" w:space="0" w:sz="0" w:val="none"/>
+          <w:left w:color="auto" w:space="0" w:sz="0" w:val="none"/>
+          <w:bottom w:color="auto" w:space="0" w:sz="0" w:val="none"/>
+          <w:right w:color="auto" w:space="0" w:sz="0" w:val="none"/>
+          <w:between w:color="auto" w:space="0" w:sz="0" w:val="none"/>
+        </w:pBdr>
+        <w:spacing w:before="160" w:lineRule="auto"/>
+        <w:rPr>
+          <w:rFonts w:ascii="Roboto" w:cs="Roboto" w:eastAsia="Roboto" w:hAnsi="Roboto"/>
+          <w:color w:val="172b4d"/>
+          <w:sz w:val="21"/>
+          <w:szCs w:val="21"/>
+        </w:rPr>
+      </w:pPr>
+      <w:r>
+        <w:rPr>
+          <w:rFonts w:ascii="Roboto" w:cs="Roboto" w:eastAsia="Roboto" w:hAnsi="Roboto"/>
+          <w:color w:val="172b4d"/>
+          <w:sz w:val="21"/>
+          <w:szCs w:val="21"/>
+          <w:rtl w:val="0"/>
+        </w:rPr>
+        <w:t xml:space="preserve">2.1.7. Система должна мгновенно сохранять созданные задачи.</w:t>
+      </w:r>
+    </w:p>
+    <w:p>
+      <w:pPr>
+        <w:pBdr>
+          <w:top w:color="auto" w:space="0" w:sz="0" w:val="none"/>
+          <w:left w:color="auto" w:space="0" w:sz="0" w:val="none"/>
+          <w:bottom w:color="auto" w:space="0" w:sz="0" w:val="none"/>
+          <w:right w:color="auto" w:space="0" w:sz="0" w:val="none"/>
+          <w:between w:color="auto" w:space="0" w:sz="0" w:val="none"/>
+        </w:pBdr>
+        <w:spacing w:before="160" w:lineRule="auto"/>
+        <w:rPr>
+          <w:rFonts w:ascii="Roboto" w:cs="Roboto" w:eastAsia="Roboto" w:hAnsi="Roboto"/>
+          <w:b w:val="1"/>
+          <w:bCs w:val="1"/>
+          <w:color w:val="172b4d"/>
+          <w:sz w:val="21"/>
+          <w:szCs w:val="21"/>
+        </w:rPr>
+      </w:pPr>
+      <w:r>
+        <w:rPr>
+          <w:rFonts w:ascii="Roboto" w:cs="Roboto" w:eastAsia="Roboto" w:hAnsi="Roboto"/>
+          <w:b w:val="1"/>
+          <w:bCs w:val="1"/>
+          <w:color w:val="172b4d"/>
+          <w:sz w:val="21"/>
+          <w:szCs w:val="21"/>
+          <w:rtl w:val="0"/>
+        </w:rPr>
+        <w:t xml:space="preserve">2.2. Редактирование задачи</w:t>
+      </w:r>
+    </w:p>
+    <w:p>
+      <w:pPr>
+        <w:pBdr>
+          <w:top w:color="auto" w:space="0" w:sz="0" w:val="none"/>
+          <w:left w:color="auto" w:space="0" w:sz="0" w:val="none"/>
+          <w:bottom w:color="auto" w:space="0" w:sz="0" w:val="none"/>
+          <w:right w:color="auto" w:space="0" w:sz="0" w:val="none"/>
+          <w:between w:color="auto" w:space="0" w:sz="0" w:val="none"/>
+        </w:pBdr>
+        <w:spacing w:before="160" w:lineRule="auto"/>
+        <w:rPr>
+          <w:rFonts w:ascii="Roboto" w:cs="Roboto" w:eastAsia="Roboto" w:hAnsi="Roboto"/>
+          <w:color w:val="172b4d"/>
+          <w:sz w:val="21"/>
+          <w:szCs w:val="21"/>
+        </w:rPr>
+      </w:pPr>
+      <w:r>
+        <w:rPr>
+          <w:rFonts w:ascii="Roboto" w:cs="Roboto" w:eastAsia="Roboto" w:hAnsi="Roboto"/>
+          <w:color w:val="172b4d"/>
+          <w:sz w:val="21"/>
+          <w:szCs w:val="21"/>
+          <w:rtl w:val="0"/>
+        </w:rPr>
+        <w:t xml:space="preserve">2.2.1. Менеджер может редактировать любую задачу в проекте.</w:t>
+      </w:r>
+    </w:p>
+    <w:p>
+      <w:pPr>
+        <w:pBdr>
+          <w:top w:color="auto" w:space="0" w:sz="0" w:val="none"/>
+          <w:left w:color="auto" w:space="0" w:sz="0" w:val="none"/>
+          <w:bottom w:color="auto" w:space="0" w:sz="0" w:val="none"/>
+          <w:right w:color="auto" w:space="0" w:sz="0" w:val="none"/>
+          <w:between w:color="auto" w:space="0" w:sz="0" w:val="none"/>
+        </w:pBdr>
+        <w:spacing w:before="160" w:lineRule="auto"/>
+        <w:rPr>
+          <w:rFonts w:ascii="Roboto" w:cs="Roboto" w:eastAsia="Roboto" w:hAnsi="Roboto"/>
+          <w:color w:val="172b4d"/>
+          <w:sz w:val="21"/>
+          <w:szCs w:val="21"/>
+        </w:rPr>
+      </w:pPr>
+      <w:r>
+        <w:rPr>
+          <w:rFonts w:ascii="Roboto" w:cs="Roboto" w:eastAsia="Roboto" w:hAnsi="Roboto"/>
+          <w:color w:val="172b4d"/>
+          <w:sz w:val="21"/>
+          <w:szCs w:val="21"/>
+          <w:rtl w:val="0"/>
+        </w:rPr>
+        <w:t xml:space="preserve">2.2.2. Исполнитель может редактировать задачи, назначенные ему.</w:t>
+      </w:r>
+    </w:p>
+    <w:p>
+      <w:pPr>
+        <w:pBdr>
+          <w:top w:color="auto" w:space="0" w:sz="0" w:val="none"/>
+          <w:left w:color="auto" w:space="0" w:sz="0" w:val="none"/>
+          <w:bottom w:color="auto" w:space="0" w:sz="0" w:val="none"/>
+          <w:right w:color="auto" w:space="0" w:sz="0" w:val="none"/>
+          <w:between w:color="auto" w:space="0" w:sz="0" w:val="none"/>
+        </w:pBdr>
+        <w:spacing w:before="160" w:lineRule="auto"/>
+        <w:rPr>
+          <w:rFonts w:ascii="Roboto" w:cs="Roboto" w:eastAsia="Roboto" w:hAnsi="Roboto"/>
+          <w:color w:val="172b4d"/>
+          <w:sz w:val="21"/>
+          <w:szCs w:val="21"/>
+        </w:rPr>
+      </w:pPr>
+      <w:r>
+        <w:rPr>
+          <w:rFonts w:ascii="Roboto" w:cs="Roboto" w:eastAsia="Roboto" w:hAnsi="Roboto"/>
+          <w:color w:val="172b4d"/>
+          <w:sz w:val="21"/>
+          <w:szCs w:val="21"/>
+          <w:rtl w:val="0"/>
+        </w:rPr>
+        <w:t xml:space="preserve">2.2.3. Редактирование задачи доступно только администратору.</w:t>
+      </w:r>
+    </w:p>
+    <w:p>
+      <w:pPr>
+        <w:pBdr>
+          <w:top w:color="auto" w:space="0" w:sz="0" w:val="none"/>
+          <w:left w:color="auto" w:space="0" w:sz="0" w:val="none"/>
+          <w:bottom w:color="auto" w:space="0" w:sz="0" w:val="none"/>
+          <w:right w:color="auto" w:space="0" w:sz="0" w:val="none"/>
+          <w:between w:color="auto" w:space="0" w:sz="0" w:val="none"/>
+        </w:pBdr>
+        <w:spacing w:before="160" w:lineRule="auto"/>
+        <w:rPr>
+          <w:rFonts w:ascii="Roboto" w:cs="Roboto" w:eastAsia="Roboto" w:hAnsi="Roboto"/>
+          <w:color w:val="172b4d"/>
+          <w:sz w:val="21"/>
+          <w:szCs w:val="21"/>
+        </w:rPr>
+      </w:pPr>
+      <w:r>
+        <w:rPr>
+          <w:rFonts w:ascii="Roboto" w:cs="Roboto" w:eastAsia="Roboto" w:hAnsi="Roboto"/>
+          <w:color w:val="172b4d"/>
+          <w:sz w:val="21"/>
+          <w:szCs w:val="21"/>
+          <w:rtl w:val="0"/>
+        </w:rPr>
+        <w:t xml:space="preserve">2.2.4. При редактировании сохраняется история изменений.</w:t>
+      </w:r>
+    </w:p>
+    <w:p>
+      <w:pPr>
+        <w:pBdr>
+          <w:top w:color="auto" w:space="0" w:sz="0" w:val="none"/>
+          <w:left w:color="auto" w:space="0" w:sz="0" w:val="none"/>
+          <w:bottom w:color="auto" w:space="0" w:sz="0" w:val="none"/>
+          <w:right w:color="auto" w:space="0" w:sz="0" w:val="none"/>
+          <w:between w:color="auto" w:space="0" w:sz="0" w:val="none"/>
+        </w:pBdr>
+        <w:spacing w:before="160" w:lineRule="auto"/>
+        <w:rPr>
+          <w:rFonts w:ascii="Roboto" w:cs="Roboto" w:eastAsia="Roboto" w:hAnsi="Roboto"/>
+          <w:color w:val="172b4d"/>
+          <w:sz w:val="21"/>
+          <w:szCs w:val="21"/>
+        </w:rPr>
+      </w:pPr>
+      <w:r>
+        <w:rPr>
+          <w:rFonts w:ascii="Roboto" w:cs="Roboto" w:eastAsia="Roboto" w:hAnsi="Roboto"/>
+          <w:color w:val="172b4d"/>
+          <w:sz w:val="21"/>
+          <w:szCs w:val="21"/>
+          <w:rtl w:val="0"/>
+        </w:rPr>
+        <w:t xml:space="preserve">2.2.5. История изменений доступна всем пользователям системы.</w:t>
+      </w:r>
+    </w:p>
+    <w:p>
+      <w:pPr>
+        <w:pBdr>
+          <w:top w:color="auto" w:space="0" w:sz="0" w:val="none"/>
+          <w:left w:color="auto" w:space="0" w:sz="0" w:val="none"/>
+          <w:bottom w:color="auto" w:space="0" w:sz="0" w:val="none"/>
+          <w:right w:color="auto" w:space="0" w:sz="0" w:val="none"/>
+          <w:between w:color="auto" w:space="0" w:sz="0" w:val="none"/>
+        </w:pBdr>
+        <w:spacing w:before="160" w:lineRule="auto"/>
+        <w:rPr>
+          <w:rFonts w:ascii="Roboto" w:cs="Roboto" w:eastAsia="Roboto" w:hAnsi="Roboto"/>
+          <w:b w:val="1"/>
+          <w:bCs w:val="1"/>
+          <w:color w:val="172b4d"/>
+          <w:sz w:val="21"/>
+          <w:szCs w:val="21"/>
+        </w:rPr>
+      </w:pPr>
+      <w:r>
+        <w:rPr>
+          <w:rFonts w:ascii="Roboto" w:cs="Roboto" w:eastAsia="Roboto" w:hAnsi="Roboto"/>
+          <w:b w:val="1"/>
+          <w:bCs w:val="1"/>
+          <w:color w:val="172b4d"/>
+          <w:sz w:val="21"/>
+          <w:szCs w:val="21"/>
+          <w:rtl w:val="0"/>
+        </w:rPr>
+        <w:t xml:space="preserve">2.3. Статусы задачи</w:t>
+      </w:r>
+    </w:p>
+    <w:p>
+      <w:pPr>
+        <w:pBdr>
+          <w:top w:color="auto" w:space="0" w:sz="0" w:val="none"/>
+          <w:left w:color="auto" w:space="0" w:sz="0" w:val="none"/>
+          <w:bottom w:color="auto" w:space="0" w:sz="0" w:val="none"/>
+          <w:right w:color="auto" w:space="0" w:sz="0" w:val="none"/>
+          <w:between w:color="auto" w:space="0" w:sz="0" w:val="none"/>
+        </w:pBdr>
+        <w:spacing w:before="160" w:lineRule="auto"/>
+        <w:rPr>
+          <w:rFonts w:ascii="Roboto" w:cs="Roboto" w:eastAsia="Roboto" w:hAnsi="Roboto"/>
+          <w:color w:val="172b4d"/>
+          <w:sz w:val="21"/>
+          <w:szCs w:val="21"/>
+        </w:rPr>
+      </w:pPr>
+      <w:r>
+        <w:rPr>
+          <w:rFonts w:ascii="Roboto" w:cs="Roboto" w:eastAsia="Roboto" w:hAnsi="Roboto"/>
+          <w:color w:val="172b4d"/>
+          <w:sz w:val="21"/>
+          <w:szCs w:val="21"/>
+          <w:rtl w:val="0"/>
+        </w:rPr>
+        <w:t xml:space="preserve">2.3.1. Задача может находиться в одном из статусов: Новая, В работе, На проверке, Выполнена, Отменена.</w:t>
+      </w:r>
+    </w:p>
+    <w:p>
+      <w:pPr>
+        <w:pBdr>
+          <w:top w:color="auto" w:space="0" w:sz="0" w:val="none"/>
+          <w:left w:color="auto" w:space="0" w:sz="0" w:val="none"/>
+          <w:bottom w:color="auto" w:space="0" w:sz="0" w:val="none"/>
+          <w:right w:color="auto" w:space="0" w:sz="0" w:val="none"/>
+          <w:between w:color="auto" w:space="0" w:sz="0" w:val="none"/>
+        </w:pBdr>
+        <w:spacing w:before="160" w:lineRule="auto"/>
+        <w:rPr>
+          <w:rFonts w:ascii="Roboto" w:cs="Roboto" w:eastAsia="Roboto" w:hAnsi="Roboto"/>
+          <w:color w:val="172b4d"/>
+          <w:sz w:val="21"/>
+          <w:szCs w:val="21"/>
+        </w:rPr>
+      </w:pPr>
+      <w:r>
+        <w:rPr>
+          <w:rFonts w:ascii="Roboto" w:cs="Roboto" w:eastAsia="Roboto" w:hAnsi="Roboto"/>
+          <w:color w:val="172b4d"/>
+          <w:sz w:val="21"/>
+          <w:szCs w:val="21"/>
+          <w:rtl w:val="0"/>
+        </w:rPr>
+        <w:t xml:space="preserve">2.3.2. Исполнитель может переводить задачу из статуса «Новая» в статус «В работе» и из «В работе» в «На проверке».</w:t>
+      </w:r>
+    </w:p>
+    <w:p>
+      <w:pPr>
+        <w:pBdr>
+          <w:top w:color="auto" w:space="0" w:sz="0" w:val="none"/>
+          <w:left w:color="auto" w:space="0" w:sz="0" w:val="none"/>
+          <w:bottom w:color="auto" w:space="0" w:sz="0" w:val="none"/>
+          <w:right w:color="auto" w:space="0" w:sz="0" w:val="none"/>
+          <w:between w:color="auto" w:space="0" w:sz="0" w:val="none"/>
+        </w:pBdr>
+        <w:spacing w:before="160" w:lineRule="auto"/>
+        <w:rPr>
+          <w:rFonts w:ascii="Roboto" w:cs="Roboto" w:eastAsia="Roboto" w:hAnsi="Roboto"/>
+          <w:color w:val="172b4d"/>
+          <w:sz w:val="21"/>
+          <w:szCs w:val="21"/>
+        </w:rPr>
+      </w:pPr>
+      <w:r>
+        <w:rPr>
+          <w:rFonts w:ascii="Roboto" w:cs="Roboto" w:eastAsia="Roboto" w:hAnsi="Roboto"/>
+          <w:color w:val="172b4d"/>
+          <w:sz w:val="21"/>
+          <w:szCs w:val="21"/>
+          <w:rtl w:val="0"/>
+        </w:rPr>
+        <w:t xml:space="preserve">2.3.3. Менеджер может переводить задачу в любой статус.</w:t>
+      </w:r>
+    </w:p>
+    <w:p>
+      <w:pPr>
+        <w:pBdr>
+          <w:top w:color="auto" w:space="0" w:sz="0" w:val="none"/>
+          <w:left w:color="auto" w:space="0" w:sz="0" w:val="none"/>
+          <w:bottom w:color="auto" w:space="0" w:sz="0" w:val="none"/>
+          <w:right w:color="auto" w:space="0" w:sz="0" w:val="none"/>
+          <w:between w:color="auto" w:space="0" w:sz="0" w:val="none"/>
+        </w:pBdr>
+        <w:spacing w:before="160" w:lineRule="auto"/>
+        <w:rPr>
+          <w:rFonts w:ascii="Roboto" w:cs="Roboto" w:eastAsia="Roboto" w:hAnsi="Roboto"/>
+          <w:color w:val="172b4d"/>
+          <w:sz w:val="21"/>
+          <w:szCs w:val="21"/>
+        </w:rPr>
+      </w:pPr>
+      <w:r>
+        <w:rPr>
+          <w:rFonts w:ascii="Roboto" w:cs="Roboto" w:eastAsia="Roboto" w:hAnsi="Roboto"/>
+          <w:color w:val="172b4d"/>
+          <w:sz w:val="21"/>
+          <w:szCs w:val="21"/>
+          <w:rtl w:val="0"/>
+        </w:rPr>
+        <w:t xml:space="preserve">2.3.4. Задачу в статусе «Выполнена» можно вернуть в статус «В работе».</w:t>
+      </w:r>
+    </w:p>
+    <w:p>
+      <w:pPr>
+        <w:pBdr>
+          <w:top w:color="auto" w:space="0" w:sz="0" w:val="none"/>
+          <w:left w:color="auto" w:space="0" w:sz="0" w:val="none"/>
+          <w:bottom w:color="auto" w:space="0" w:sz="0" w:val="none"/>
+          <w:right w:color="auto" w:space="0" w:sz="0" w:val="none"/>
+          <w:between w:color="auto" w:space="0" w:sz="0" w:val="none"/>
+        </w:pBdr>
+        <w:spacing w:before="160" w:lineRule="auto"/>
+        <w:rPr>
+          <w:rFonts w:ascii="Roboto" w:cs="Roboto" w:eastAsia="Roboto" w:hAnsi="Roboto"/>
+          <w:color w:val="172b4d"/>
+          <w:sz w:val="21"/>
+          <w:szCs w:val="21"/>
+        </w:rPr>
+      </w:pPr>
+      <w:r>
+        <w:rPr>
+          <w:rFonts w:ascii="Roboto" w:cs="Roboto" w:eastAsia="Roboto" w:hAnsi="Roboto"/>
+          <w:color w:val="172b4d"/>
+          <w:sz w:val="21"/>
+          <w:szCs w:val="21"/>
+          <w:rtl w:val="0"/>
+        </w:rPr>
+        <w:t xml:space="preserve">2.3.5. Задачу в статусе «Отменена» изменить нельзя.</w:t>
+      </w:r>
+    </w:p>
+    <w:p>
+      <w:pPr>
+        <w:pBdr>
+          <w:top w:color="auto" w:space="0" w:sz="0" w:val="none"/>
+          <w:left w:color="auto" w:space="0" w:sz="0" w:val="none"/>
+          <w:bottom w:color="auto" w:space="0" w:sz="0" w:val="none"/>
+          <w:right w:color="auto" w:space="0" w:sz="0" w:val="none"/>
+          <w:between w:color="auto" w:space="0" w:sz="0" w:val="none"/>
+        </w:pBdr>
+        <w:spacing w:before="160" w:lineRule="auto"/>
+        <w:rPr>
+          <w:rFonts w:ascii="Roboto" w:cs="Roboto" w:eastAsia="Roboto" w:hAnsi="Roboto"/>
+          <w:color w:val="172b4d"/>
+          <w:sz w:val="21"/>
+          <w:szCs w:val="21"/>
+        </w:rPr>
+      </w:pPr>
+      <w:r>
+        <w:rPr>
+          <w:rFonts w:ascii="Roboto" w:cs="Roboto" w:eastAsia="Roboto" w:hAnsi="Roboto"/>
+          <w:color w:val="172b4d"/>
+          <w:sz w:val="21"/>
+          <w:szCs w:val="21"/>
+          <w:rtl w:val="0"/>
+        </w:rPr>
+        <w:t xml:space="preserve">2.3.6. При смене статуса система отправляет уведомление всем участникам задачи.</w:t>
+      </w:r>
+    </w:p>
+    <w:p>
+      <w:pPr>
+        <w:pBdr>
+          <w:top w:color="auto" w:space="0" w:sz="0" w:val="none"/>
+          <w:left w:color="auto" w:space="0" w:sz="0" w:val="none"/>
+          <w:bottom w:color="auto" w:space="0" w:sz="0" w:val="none"/>
+          <w:right w:color="auto" w:space="0" w:sz="0" w:val="none"/>
+          <w:between w:color="auto" w:space="0" w:sz="0" w:val="none"/>
+        </w:pBdr>
+        <w:spacing w:before="160" w:lineRule="auto"/>
+        <w:rPr>
+          <w:rFonts w:ascii="Roboto" w:cs="Roboto" w:eastAsia="Roboto" w:hAnsi="Roboto"/>
+          <w:b w:val="1"/>
+          <w:bCs w:val="1"/>
+          <w:color w:val="172b4d"/>
+          <w:sz w:val="21"/>
+          <w:szCs w:val="21"/>
+        </w:rPr>
+      </w:pPr>
+      <w:r>
+        <w:rPr>
+          <w:rFonts w:ascii="Roboto" w:cs="Roboto" w:eastAsia="Roboto" w:hAnsi="Roboto"/>
+          <w:b w:val="1"/>
+          <w:bCs w:val="1"/>
+          <w:color w:val="172b4d"/>
+          <w:sz w:val="21"/>
+          <w:szCs w:val="21"/>
+          <w:rtl w:val="0"/>
+        </w:rPr>
+        <w:t xml:space="preserve">2.4. Удаление задачи</w:t>
+      </w:r>
+    </w:p>
+    <w:p>
+      <w:pPr>
+        <w:pBdr>
+          <w:top w:color="auto" w:space="0" w:sz="0" w:val="none"/>
+          <w:left w:color="auto" w:space="0" w:sz="0" w:val="none"/>
+          <w:bottom w:color="auto" w:space="0" w:sz="0" w:val="none"/>
+          <w:right w:color="auto" w:space="0" w:sz="0" w:val="none"/>
+          <w:between w:color="auto" w:space="0" w:sz="0" w:val="none"/>
+        </w:pBdr>
+        <w:spacing w:before="160" w:lineRule="auto"/>
+        <w:rPr>
+          <w:rFonts w:ascii="Roboto" w:cs="Roboto" w:eastAsia="Roboto" w:hAnsi="Roboto"/>
+          <w:color w:val="172b4d"/>
+          <w:sz w:val="21"/>
+          <w:szCs w:val="21"/>
+        </w:rPr>
+      </w:pPr>
+      <w:r>
+        <w:rPr>
+          <w:rFonts w:ascii="Roboto" w:cs="Roboto" w:eastAsia="Roboto" w:hAnsi="Roboto"/>
+          <w:color w:val="172b4d"/>
+          <w:sz w:val="21"/>
+          <w:szCs w:val="21"/>
+          <w:rtl w:val="0"/>
+        </w:rPr>
+        <w:t xml:space="preserve">2.4.1. Только администратор может удалять задачи.</w:t>
+      </w:r>
+    </w:p>
+    <w:p>
+      <w:pPr>
+        <w:pBdr>
+          <w:top w:color="auto" w:space="0" w:sz="0" w:val="none"/>
+          <w:left w:color="auto" w:space="0" w:sz="0" w:val="none"/>
+          <w:bottom w:color="auto" w:space="0" w:sz="0" w:val="none"/>
+          <w:right w:color="auto" w:space="0" w:sz="0" w:val="none"/>
+          <w:between w:color="auto" w:space="0" w:sz="0" w:val="none"/>
+        </w:pBdr>
+        <w:spacing w:before="160" w:lineRule="auto"/>
+        <w:rPr>
+          <w:rFonts w:ascii="Roboto" w:cs="Roboto" w:eastAsia="Roboto" w:hAnsi="Roboto"/>
+          <w:color w:val="172b4d"/>
+          <w:sz w:val="21"/>
+          <w:szCs w:val="21"/>
+        </w:rPr>
+      </w:pPr>
+      <w:r>
+        <w:rPr>
+          <w:rFonts w:ascii="Roboto" w:cs="Roboto" w:eastAsia="Roboto" w:hAnsi="Roboto"/>
+          <w:color w:val="172b4d"/>
+          <w:sz w:val="21"/>
+          <w:szCs w:val="21"/>
+          <w:rtl w:val="0"/>
+        </w:rPr>
+        <w:t xml:space="preserve">2.4.2. Менеджер может удалять задачи, созданные им.</w:t>
+      </w:r>
+    </w:p>
+    <w:p>
+      <w:pPr>
+        <w:pBdr>
+          <w:top w:color="auto" w:space="0" w:sz="0" w:val="none"/>
+          <w:left w:color="auto" w:space="0" w:sz="0" w:val="none"/>
+          <w:bottom w:color="auto" w:space="0" w:sz="0" w:val="none"/>
+          <w:right w:color="auto" w:space="0" w:sz="0" w:val="none"/>
+          <w:between w:color="auto" w:space="0" w:sz="0" w:val="none"/>
+        </w:pBdr>
+        <w:spacing w:before="160" w:lineRule="auto"/>
+        <w:rPr>
+          <w:rFonts w:ascii="Roboto" w:cs="Roboto" w:eastAsia="Roboto" w:hAnsi="Roboto"/>
+          <w:color w:val="172b4d"/>
+          <w:sz w:val="21"/>
+          <w:szCs w:val="21"/>
+        </w:rPr>
+      </w:pPr>
+      <w:r>
+        <w:rPr>
+          <w:rFonts w:ascii="Roboto" w:cs="Roboto" w:eastAsia="Roboto" w:hAnsi="Roboto"/>
+          <w:color w:val="172b4d"/>
+          <w:sz w:val="21"/>
+          <w:szCs w:val="21"/>
+          <w:rtl w:val="0"/>
+        </w:rPr>
+        <w:t xml:space="preserve">2.4.3. Удалённую задачу можно восстановить в течение 30 дней.</w:t>
+      </w:r>
+    </w:p>
+    <w:p>
+      <w:pPr>
+        <w:pBdr>
+          <w:top w:color="auto" w:space="0" w:sz="0" w:val="none"/>
+          <w:left w:color="auto" w:space="0" w:sz="0" w:val="none"/>
+          <w:bottom w:color="auto" w:space="0" w:sz="0" w:val="none"/>
+          <w:right w:color="auto" w:space="0" w:sz="0" w:val="none"/>
+          <w:between w:color="auto" w:space="0" w:sz="0" w:val="none"/>
+        </w:pBdr>
+        <w:spacing w:before="160" w:lineRule="auto"/>
+        <w:rPr>
+          <w:rFonts w:ascii="Roboto" w:cs="Roboto" w:eastAsia="Roboto" w:hAnsi="Roboto"/>
+          <w:color w:val="172b4d"/>
+          <w:sz w:val="21"/>
+          <w:szCs w:val="21"/>
+        </w:rPr>
+      </w:pPr>
+      <w:r>
+        <w:rPr>
+          <w:rFonts w:ascii="Roboto" w:cs="Roboto" w:eastAsia="Roboto" w:hAnsi="Roboto"/>
+          <w:color w:val="172b4d"/>
+          <w:sz w:val="21"/>
+          <w:szCs w:val="21"/>
+          <w:rtl w:val="0"/>
+        </w:rPr>
+        <w:t xml:space="preserve">2.4.4. Задача удаляется без подтверждения.</w:t>
+      </w:r>
+    </w:p>
+    <w:p>
+      <w:pPr>
+        <w:pBdr>
+          <w:top w:color="auto" w:space="0" w:sz="0" w:val="none"/>
+          <w:left w:color="auto" w:space="0" w:sz="0" w:val="none"/>
+          <w:bottom w:color="auto" w:space="0" w:sz="0" w:val="none"/>
+          <w:right w:color="auto" w:space="0" w:sz="0" w:val="none"/>
+          <w:between w:color="auto" w:space="0" w:sz="0" w:val="none"/>
+        </w:pBdr>
+        <w:spacing w:before="160" w:lineRule="auto"/>
+        <w:rPr>
+          <w:rFonts w:ascii="Roboto" w:cs="Roboto" w:eastAsia="Roboto" w:hAnsi="Roboto"/>
+          <w:b w:val="1"/>
+          <w:bCs w:val="1"/>
+          <w:color w:val="172b4d"/>
+          <w:sz w:val="21"/>
+          <w:szCs w:val="21"/>
+        </w:rPr>
+      </w:pPr>
+      <w:r>
+        <w:rPr>
+          <w:rFonts w:ascii="Roboto" w:cs="Roboto" w:eastAsia="Roboto" w:hAnsi="Roboto"/>
+          <w:b w:val="1"/>
+          <w:bCs w:val="1"/>
+          <w:color w:val="172b4d"/>
+          <w:sz w:val="21"/>
+          <w:szCs w:val="21"/>
+          <w:rtl w:val="0"/>
+        </w:rPr>
+        <w:t xml:space="preserve">3. Управление проектами</w:t>
+      </w:r>
+    </w:p>
+    <w:p>
+      <w:pPr>
+        <w:pBdr>
+          <w:top w:color="auto" w:space="0" w:sz="0" w:val="none"/>
+          <w:left w:color="auto" w:space="0" w:sz="0" w:val="none"/>
+          <w:bottom w:color="auto" w:space="0" w:sz="0" w:val="none"/>
+          <w:right w:color="auto" w:space="0" w:sz="0" w:val="none"/>
+          <w:between w:color="auto" w:space="0" w:sz="0" w:val="none"/>
+        </w:pBdr>
+        <w:spacing w:before="160" w:lineRule="auto"/>
+        <w:rPr>
+          <w:rFonts w:ascii="Roboto" w:cs="Roboto" w:eastAsia="Roboto" w:hAnsi="Roboto"/>
+          <w:b w:val="1"/>
+          <w:bCs w:val="1"/>
+          <w:color w:val="172b4d"/>
+          <w:sz w:val="21"/>
+          <w:szCs w:val="21"/>
+        </w:rPr>
+      </w:pPr>
+      <w:r>
+        <w:rPr>
+          <w:rFonts w:ascii="Roboto" w:cs="Roboto" w:eastAsia="Roboto" w:hAnsi="Roboto"/>
+          <w:b w:val="1"/>
+          <w:bCs w:val="1"/>
+          <w:color w:val="172b4d"/>
+          <w:sz w:val="21"/>
+          <w:szCs w:val="21"/>
+          <w:rtl w:val="0"/>
+        </w:rPr>
+        <w:t xml:space="preserve">3.1. Создание проекта</w:t>
+      </w:r>
+    </w:p>
+    <w:p>
+      <w:pPr>
+        <w:pBdr>
+          <w:top w:color="auto" w:space="0" w:sz="0" w:val="none"/>
+          <w:left w:color="auto" w:space="0" w:sz="0" w:val="none"/>
+          <w:bottom w:color="auto" w:space="0" w:sz="0" w:val="none"/>
+          <w:right w:color="auto" w:space="0" w:sz="0" w:val="none"/>
+          <w:between w:color="auto" w:space="0" w:sz="0" w:val="none"/>
+        </w:pBdr>
+        <w:spacing w:before="160" w:lineRule="auto"/>
+        <w:rPr>
+          <w:rFonts w:ascii="Roboto" w:cs="Roboto" w:eastAsia="Roboto" w:hAnsi="Roboto"/>
+          <w:color w:val="172b4d"/>
+          <w:sz w:val="21"/>
+          <w:szCs w:val="21"/>
+        </w:rPr>
+      </w:pPr>
+      <w:r>
+        <w:rPr>
+          <w:rFonts w:ascii="Roboto" w:cs="Roboto" w:eastAsia="Roboto" w:hAnsi="Roboto"/>
+          <w:color w:val="172b4d"/>
+          <w:sz w:val="21"/>
+          <w:szCs w:val="21"/>
+          <w:rtl w:val="0"/>
+        </w:rPr>
+        <w:t xml:space="preserve">3.1.1. Менеджер может создавать проекты.</w:t>
+      </w:r>
+    </w:p>
+    <w:p>
+      <w:pPr>
+        <w:pBdr>
+          <w:top w:color="auto" w:space="0" w:sz="0" w:val="none"/>
+          <w:left w:color="auto" w:space="0" w:sz="0" w:val="none"/>
+          <w:bottom w:color="auto" w:space="0" w:sz="0" w:val="none"/>
+          <w:right w:color="auto" w:space="0" w:sz="0" w:val="none"/>
+          <w:between w:color="auto" w:space="0" w:sz="0" w:val="none"/>
+        </w:pBdr>
+        <w:spacing w:before="160" w:lineRule="auto"/>
+        <w:rPr>
+          <w:rFonts w:ascii="Roboto" w:cs="Roboto" w:eastAsia="Roboto" w:hAnsi="Roboto"/>
+          <w:color w:val="172b4d"/>
+          <w:sz w:val="21"/>
+          <w:szCs w:val="21"/>
+        </w:rPr>
+      </w:pPr>
+      <w:r>
+        <w:rPr>
+          <w:rFonts w:ascii="Roboto" w:cs="Roboto" w:eastAsia="Roboto" w:hAnsi="Roboto"/>
+          <w:color w:val="172b4d"/>
+          <w:sz w:val="21"/>
+          <w:szCs w:val="21"/>
+          <w:rtl w:val="0"/>
+        </w:rPr>
+        <w:t xml:space="preserve">3.1.2. Название проекта должно быть уникальным.</w:t>
+      </w:r>
+    </w:p>
+    <w:p>
+      <w:pPr>
+        <w:pBdr>
+          <w:top w:color="auto" w:space="0" w:sz="0" w:val="none"/>
+          <w:left w:color="auto" w:space="0" w:sz="0" w:val="none"/>
+          <w:bottom w:color="auto" w:space="0" w:sz="0" w:val="none"/>
+          <w:right w:color="auto" w:space="0" w:sz="0" w:val="none"/>
+          <w:between w:color="auto" w:space="0" w:sz="0" w:val="none"/>
+        </w:pBdr>
+        <w:spacing w:before="160" w:lineRule="auto"/>
+        <w:rPr>
+          <w:rFonts w:ascii="Roboto" w:cs="Roboto" w:eastAsia="Roboto" w:hAnsi="Roboto"/>
+          <w:color w:val="172b4d"/>
+          <w:sz w:val="21"/>
+          <w:szCs w:val="21"/>
+        </w:rPr>
+      </w:pPr>
+      <w:r>
+        <w:rPr>
+          <w:rFonts w:ascii="Roboto" w:cs="Roboto" w:eastAsia="Roboto" w:hAnsi="Roboto"/>
+          <w:color w:val="172b4d"/>
+          <w:sz w:val="21"/>
+          <w:szCs w:val="21"/>
+          <w:rtl w:val="0"/>
+        </w:rPr>
+        <w:t xml:space="preserve">3.1.3. Проект должен содержать хотя бы одного участника.</w:t>
+      </w:r>
+    </w:p>
+    <w:p>
+      <w:pPr>
+        <w:pBdr>
+          <w:top w:color="auto" w:space="0" w:sz="0" w:val="none"/>
+          <w:left w:color="auto" w:space="0" w:sz="0" w:val="none"/>
+          <w:bottom w:color="auto" w:space="0" w:sz="0" w:val="none"/>
+          <w:right w:color="auto" w:space="0" w:sz="0" w:val="none"/>
+          <w:between w:color="auto" w:space="0" w:sz="0" w:val="none"/>
+        </w:pBdr>
+        <w:spacing w:before="160" w:lineRule="auto"/>
+        <w:rPr>
+          <w:rFonts w:ascii="Roboto" w:cs="Roboto" w:eastAsia="Roboto" w:hAnsi="Roboto"/>
+          <w:color w:val="172b4d"/>
+          <w:sz w:val="21"/>
+          <w:szCs w:val="21"/>
+        </w:rPr>
+      </w:pPr>
+      <w:r>
+        <w:rPr>
+          <w:rFonts w:ascii="Roboto" w:cs="Roboto" w:eastAsia="Roboto" w:hAnsi="Roboto"/>
+          <w:color w:val="172b4d"/>
+          <w:sz w:val="21"/>
+          <w:szCs w:val="21"/>
+          <w:rtl w:val="0"/>
+        </w:rPr>
+        <w:t xml:space="preserve">3.1.4. Дата начала проекта должна быть раньше даты окончания.</w:t>
+      </w:r>
+    </w:p>
+    <w:p>
+      <w:pPr>
+        <w:pBdr>
+          <w:top w:color="auto" w:space="0" w:sz="0" w:val="none"/>
+          <w:left w:color="auto" w:space="0" w:sz="0" w:val="none"/>
+          <w:bottom w:color="auto" w:space="0" w:sz="0" w:val="none"/>
+          <w:right w:color="auto" w:space="0" w:sz="0" w:val="none"/>
+          <w:between w:color="auto" w:space="0" w:sz="0" w:val="none"/>
+        </w:pBdr>
+        <w:spacing w:before="160" w:lineRule="auto"/>
+        <w:rPr>
+          <w:rFonts w:ascii="Roboto" w:cs="Roboto" w:eastAsia="Roboto" w:hAnsi="Roboto"/>
+          <w:color w:val="172b4d"/>
+          <w:sz w:val="21"/>
+          <w:szCs w:val="21"/>
+        </w:rPr>
+      </w:pPr>
+      <w:r>
+        <w:rPr>
+          <w:rFonts w:ascii="Roboto" w:cs="Roboto" w:eastAsia="Roboto" w:hAnsi="Roboto"/>
+          <w:color w:val="172b4d"/>
+          <w:sz w:val="21"/>
+          <w:szCs w:val="21"/>
+          <w:rtl w:val="0"/>
+        </w:rPr>
+        <w:t xml:space="preserve">3.1.5. Количество проектов у одного менеджера не ограничено.</w:t>
+      </w:r>
+    </w:p>
+    <w:p>
+      <w:pPr>
+        <w:pBdr>
+          <w:top w:color="auto" w:space="0" w:sz="0" w:val="none"/>
+          <w:left w:color="auto" w:space="0" w:sz="0" w:val="none"/>
+          <w:bottom w:color="auto" w:space="0" w:sz="0" w:val="none"/>
+          <w:right w:color="auto" w:space="0" w:sz="0" w:val="none"/>
+          <w:between w:color="auto" w:space="0" w:sz="0" w:val="none"/>
+        </w:pBdr>
+        <w:spacing w:before="160" w:lineRule="auto"/>
+        <w:rPr>
+          <w:rFonts w:ascii="Roboto" w:cs="Roboto" w:eastAsia="Roboto" w:hAnsi="Roboto"/>
+          <w:b w:val="1"/>
+          <w:bCs w:val="1"/>
+          <w:color w:val="172b4d"/>
+          <w:sz w:val="21"/>
+          <w:szCs w:val="21"/>
+        </w:rPr>
+      </w:pPr>
+      <w:r>
+        <w:rPr>
+          <w:rFonts w:ascii="Roboto" w:cs="Roboto" w:eastAsia="Roboto" w:hAnsi="Roboto"/>
+          <w:b w:val="1"/>
+          <w:bCs w:val="1"/>
+          <w:color w:val="172b4d"/>
+          <w:sz w:val="21"/>
+          <w:szCs w:val="21"/>
+          <w:rtl w:val="0"/>
+        </w:rPr>
+        <w:t xml:space="preserve">3.2. Участники проекта</w:t>
+      </w:r>
+    </w:p>
+    <w:p>
+      <w:pPr>
+        <w:pBdr>
+          <w:top w:color="auto" w:space="0" w:sz="0" w:val="none"/>
+          <w:left w:color="auto" w:space="0" w:sz="0" w:val="none"/>
+          <w:bottom w:color="auto" w:space="0" w:sz="0" w:val="none"/>
+          <w:right w:color="auto" w:space="0" w:sz="0" w:val="none"/>
+          <w:between w:color="auto" w:space="0" w:sz="0" w:val="none"/>
+        </w:pBdr>
+        <w:spacing w:before="160" w:lineRule="auto"/>
+        <w:rPr>
+          <w:rFonts w:ascii="Roboto" w:cs="Roboto" w:eastAsia="Roboto" w:hAnsi="Roboto"/>
+          <w:color w:val="172b4d"/>
+          <w:sz w:val="21"/>
+          <w:szCs w:val="21"/>
+        </w:rPr>
+      </w:pPr>
+      <w:r>
+        <w:rPr>
+          <w:rFonts w:ascii="Roboto" w:cs="Roboto" w:eastAsia="Roboto" w:hAnsi="Roboto"/>
+          <w:color w:val="172b4d"/>
+          <w:sz w:val="21"/>
+          <w:szCs w:val="21"/>
+          <w:rtl w:val="0"/>
+        </w:rPr>
+        <w:t xml:space="preserve">3.2.1. Менеджер может добавлять и удалять участников проекта.</w:t>
+      </w:r>
+    </w:p>
+    <w:p>
+      <w:pPr>
+        <w:pBdr>
+          <w:top w:color="auto" w:space="0" w:sz="0" w:val="none"/>
+          <w:left w:color="auto" w:space="0" w:sz="0" w:val="none"/>
+          <w:bottom w:color="auto" w:space="0" w:sz="0" w:val="none"/>
+          <w:right w:color="auto" w:space="0" w:sz="0" w:val="none"/>
+          <w:between w:color="auto" w:space="0" w:sz="0" w:val="none"/>
+        </w:pBdr>
+        <w:spacing w:before="160" w:lineRule="auto"/>
+        <w:rPr>
+          <w:rFonts w:ascii="Roboto" w:cs="Roboto" w:eastAsia="Roboto" w:hAnsi="Roboto"/>
+          <w:color w:val="172b4d"/>
+          <w:sz w:val="21"/>
+          <w:szCs w:val="21"/>
+        </w:rPr>
+      </w:pPr>
+      <w:r>
+        <w:rPr>
+          <w:rFonts w:ascii="Roboto" w:cs="Roboto" w:eastAsia="Roboto" w:hAnsi="Roboto"/>
+          <w:color w:val="172b4d"/>
+          <w:sz w:val="21"/>
+          <w:szCs w:val="21"/>
+          <w:rtl w:val="0"/>
+        </w:rPr>
+        <w:t xml:space="preserve">3.2.2. Удалённый из проекта участник теряет доступ ко всем задачам проекта.</w:t>
+      </w:r>
+    </w:p>
+    <w:p>
+      <w:pPr>
+        <w:pBdr>
+          <w:top w:color="auto" w:space="0" w:sz="0" w:val="none"/>
+          <w:left w:color="auto" w:space="0" w:sz="0" w:val="none"/>
+          <w:bottom w:color="auto" w:space="0" w:sz="0" w:val="none"/>
+          <w:right w:color="auto" w:space="0" w:sz="0" w:val="none"/>
+          <w:between w:color="auto" w:space="0" w:sz="0" w:val="none"/>
+        </w:pBdr>
+        <w:spacing w:before="160" w:lineRule="auto"/>
+        <w:rPr>
+          <w:rFonts w:ascii="Roboto" w:cs="Roboto" w:eastAsia="Roboto" w:hAnsi="Roboto"/>
+          <w:color w:val="172b4d"/>
+          <w:sz w:val="21"/>
+          <w:szCs w:val="21"/>
+        </w:rPr>
+      </w:pPr>
+      <w:r>
+        <w:rPr>
+          <w:rFonts w:ascii="Roboto" w:cs="Roboto" w:eastAsia="Roboto" w:hAnsi="Roboto"/>
+          <w:color w:val="172b4d"/>
+          <w:sz w:val="21"/>
+          <w:szCs w:val="21"/>
+          <w:rtl w:val="0"/>
+        </w:rPr>
+        <w:t xml:space="preserve">3.2.3. Удалённый участник сохраняет доступ к своим задачам в проекте.</w:t>
+      </w:r>
+    </w:p>
+    <w:p>
+      <w:pPr>
+        <w:pBdr>
+          <w:top w:color="auto" w:space="0" w:sz="0" w:val="none"/>
+          <w:left w:color="auto" w:space="0" w:sz="0" w:val="none"/>
+          <w:bottom w:color="auto" w:space="0" w:sz="0" w:val="none"/>
+          <w:right w:color="auto" w:space="0" w:sz="0" w:val="none"/>
+          <w:between w:color="auto" w:space="0" w:sz="0" w:val="none"/>
+        </w:pBdr>
+        <w:spacing w:before="160" w:lineRule="auto"/>
+        <w:rPr>
+          <w:rFonts w:ascii="Roboto" w:cs="Roboto" w:eastAsia="Roboto" w:hAnsi="Roboto"/>
+          <w:color w:val="172b4d"/>
+          <w:sz w:val="21"/>
+          <w:szCs w:val="21"/>
+        </w:rPr>
+      </w:pPr>
+      <w:r>
+        <w:rPr>
+          <w:rFonts w:ascii="Roboto" w:cs="Roboto" w:eastAsia="Roboto" w:hAnsi="Roboto"/>
+          <w:color w:val="172b4d"/>
+          <w:sz w:val="21"/>
+          <w:szCs w:val="21"/>
+          <w:rtl w:val="0"/>
+        </w:rPr>
+        <w:t xml:space="preserve">3.2.4. Участник не может выйти из проекта самостоятельно.</w:t>
+      </w:r>
+    </w:p>
+    <w:p>
+      <w:pPr>
+        <w:pBdr>
+          <w:top w:color="auto" w:space="0" w:sz="0" w:val="none"/>
+          <w:left w:color="auto" w:space="0" w:sz="0" w:val="none"/>
+          <w:bottom w:color="auto" w:space="0" w:sz="0" w:val="none"/>
+          <w:right w:color="auto" w:space="0" w:sz="0" w:val="none"/>
+          <w:between w:color="auto" w:space="0" w:sz="0" w:val="none"/>
+        </w:pBdr>
+        <w:spacing w:before="160" w:lineRule="auto"/>
+        <w:rPr>
+          <w:rFonts w:ascii="Roboto" w:cs="Roboto" w:eastAsia="Roboto" w:hAnsi="Roboto"/>
+          <w:b w:val="1"/>
+          <w:bCs w:val="1"/>
+          <w:color w:val="172b4d"/>
+          <w:sz w:val="21"/>
+          <w:szCs w:val="21"/>
+        </w:rPr>
+      </w:pPr>
+      <w:r>
+        <w:rPr>
+          <w:rFonts w:ascii="Roboto" w:cs="Roboto" w:eastAsia="Roboto" w:hAnsi="Roboto"/>
+          <w:b w:val="1"/>
+          <w:bCs w:val="1"/>
+          <w:color w:val="172b4d"/>
+          <w:sz w:val="21"/>
+          <w:szCs w:val="21"/>
+          <w:rtl w:val="0"/>
+        </w:rPr>
+        <w:t xml:space="preserve">3.3. Закрытие проекта</w:t>
+      </w:r>
+    </w:p>
+    <w:p>
+      <w:pPr>
+        <w:pBdr>
+          <w:top w:color="auto" w:space="0" w:sz="0" w:val="none"/>
+          <w:left w:color="auto" w:space="0" w:sz="0" w:val="none"/>
+          <w:bottom w:color="auto" w:space="0" w:sz="0" w:val="none"/>
+          <w:right w:color="auto" w:space="0" w:sz="0" w:val="none"/>
+          <w:between w:color="auto" w:space="0" w:sz="0" w:val="none"/>
+        </w:pBdr>
+        <w:spacing w:before="160" w:lineRule="auto"/>
+        <w:rPr>
+          <w:rFonts w:ascii="Roboto" w:cs="Roboto" w:eastAsia="Roboto" w:hAnsi="Roboto"/>
+          <w:color w:val="172b4d"/>
+          <w:sz w:val="21"/>
+          <w:szCs w:val="21"/>
+        </w:rPr>
+      </w:pPr>
+      <w:r>
+        <w:rPr>
+          <w:rFonts w:ascii="Roboto" w:cs="Roboto" w:eastAsia="Roboto" w:hAnsi="Roboto"/>
+          <w:color w:val="172b4d"/>
+          <w:sz w:val="21"/>
+          <w:szCs w:val="21"/>
+          <w:rtl w:val="0"/>
+        </w:rPr>
+        <w:t xml:space="preserve">3.3.1. Менеджер может закрыть проект.</w:t>
+      </w:r>
+    </w:p>
+    <w:p>
+      <w:pPr>
+        <w:pBdr>
+          <w:top w:color="auto" w:space="0" w:sz="0" w:val="none"/>
+          <w:left w:color="auto" w:space="0" w:sz="0" w:val="none"/>
+          <w:bottom w:color="auto" w:space="0" w:sz="0" w:val="none"/>
+          <w:right w:color="auto" w:space="0" w:sz="0" w:val="none"/>
+          <w:between w:color="auto" w:space="0" w:sz="0" w:val="none"/>
+        </w:pBdr>
+        <w:spacing w:before="160" w:lineRule="auto"/>
+        <w:rPr>
+          <w:rFonts w:ascii="Roboto" w:cs="Roboto" w:eastAsia="Roboto" w:hAnsi="Roboto"/>
+          <w:color w:val="172b4d"/>
+          <w:sz w:val="21"/>
+          <w:szCs w:val="21"/>
+        </w:rPr>
+      </w:pPr>
+      <w:r>
+        <w:rPr>
+          <w:rFonts w:ascii="Roboto" w:cs="Roboto" w:eastAsia="Roboto" w:hAnsi="Roboto"/>
+          <w:color w:val="172b4d"/>
+          <w:sz w:val="21"/>
+          <w:szCs w:val="21"/>
+          <w:rtl w:val="0"/>
+        </w:rPr>
+        <w:t xml:space="preserve">3.3.2. При закрытии проекта все задачи переводятся в статус «Выполнена».</w:t>
+      </w:r>
+    </w:p>
+    <w:p>
+      <w:pPr>
+        <w:pBdr>
+          <w:top w:color="auto" w:space="0" w:sz="0" w:val="none"/>
+          <w:left w:color="auto" w:space="0" w:sz="0" w:val="none"/>
+          <w:bottom w:color="auto" w:space="0" w:sz="0" w:val="none"/>
+          <w:right w:color="auto" w:space="0" w:sz="0" w:val="none"/>
+          <w:between w:color="auto" w:space="0" w:sz="0" w:val="none"/>
+        </w:pBdr>
+        <w:spacing w:before="160" w:lineRule="auto"/>
+        <w:rPr>
+          <w:rFonts w:ascii="Roboto" w:cs="Roboto" w:eastAsia="Roboto" w:hAnsi="Roboto"/>
+          <w:color w:val="172b4d"/>
+          <w:sz w:val="21"/>
+          <w:szCs w:val="21"/>
+        </w:rPr>
+      </w:pPr>
+      <w:r>
+        <w:rPr>
+          <w:rFonts w:ascii="Roboto" w:cs="Roboto" w:eastAsia="Roboto" w:hAnsi="Roboto"/>
+          <w:color w:val="172b4d"/>
+          <w:sz w:val="21"/>
+          <w:szCs w:val="21"/>
+          <w:rtl w:val="0"/>
+        </w:rPr>
+        <w:t xml:space="preserve">3.3.3. Закрытый проект нельзя редактировать.</w:t>
+      </w:r>
+    </w:p>
+    <w:p>
+      <w:pPr>
+        <w:pBdr>
+          <w:top w:color="auto" w:space="0" w:sz="0" w:val="none"/>
+          <w:left w:color="auto" w:space="0" w:sz="0" w:val="none"/>
+          <w:bottom w:color="auto" w:space="0" w:sz="0" w:val="none"/>
+          <w:right w:color="auto" w:space="0" w:sz="0" w:val="none"/>
+          <w:between w:color="auto" w:space="0" w:sz="0" w:val="none"/>
+        </w:pBdr>
+        <w:spacing w:before="160" w:lineRule="auto"/>
+        <w:rPr>
+          <w:rFonts w:ascii="Roboto" w:cs="Roboto" w:eastAsia="Roboto" w:hAnsi="Roboto"/>
+          <w:color w:val="172b4d"/>
+          <w:sz w:val="21"/>
+          <w:szCs w:val="21"/>
+        </w:rPr>
+      </w:pPr>
+      <w:r>
+        <w:rPr>
+          <w:rFonts w:ascii="Roboto" w:cs="Roboto" w:eastAsia="Roboto" w:hAnsi="Roboto"/>
+          <w:color w:val="172b4d"/>
+          <w:sz w:val="21"/>
+          <w:szCs w:val="21"/>
+          <w:rtl w:val="0"/>
+        </w:rPr>
+        <w:t xml:space="preserve">3.3.4. В закрытом проекте можно создавать новые задачи.</w:t>
+      </w:r>
+    </w:p>
+    <w:p>
+      <w:pPr>
+        <w:pBdr>
+          <w:top w:color="auto" w:space="0" w:sz="0" w:val="none"/>
+          <w:left w:color="auto" w:space="0" w:sz="0" w:val="none"/>
+          <w:bottom w:color="auto" w:space="0" w:sz="0" w:val="none"/>
+          <w:right w:color="auto" w:space="0" w:sz="0" w:val="none"/>
+          <w:between w:color="auto" w:space="0" w:sz="0" w:val="none"/>
+        </w:pBdr>
+        <w:spacing w:before="160" w:lineRule="auto"/>
+        <w:rPr>
+          <w:rFonts w:ascii="Roboto" w:cs="Roboto" w:eastAsia="Roboto" w:hAnsi="Roboto"/>
+          <w:b w:val="1"/>
+          <w:bCs w:val="1"/>
+          <w:color w:val="172b4d"/>
+          <w:sz w:val="21"/>
+          <w:szCs w:val="21"/>
+        </w:rPr>
+      </w:pPr>
+      <w:r>
+        <w:rPr>
+          <w:rFonts w:ascii="Roboto" w:cs="Roboto" w:eastAsia="Roboto" w:hAnsi="Roboto"/>
+          <w:b w:val="1"/>
+          <w:bCs w:val="1"/>
+          <w:color w:val="172b4d"/>
+          <w:sz w:val="21"/>
+          <w:szCs w:val="21"/>
+          <w:rtl w:val="0"/>
+        </w:rPr>
+        <w:t xml:space="preserve">4. Уведомления</w:t>
+      </w:r>
+    </w:p>
+    <w:p>
+      <w:pPr>
+        <w:pBdr>
+          <w:top w:color="auto" w:space="0" w:sz="0" w:val="none"/>
+          <w:left w:color="auto" w:space="0" w:sz="0" w:val="none"/>
+          <w:bottom w:color="auto" w:space="0" w:sz="0" w:val="none"/>
+          <w:right w:color="auto" w:space="0" w:sz="0" w:val="none"/>
+          <w:between w:color="auto" w:space="0" w:sz="0" w:val="none"/>
+        </w:pBdr>
+        <w:spacing w:before="160" w:lineRule="auto"/>
+        <w:rPr>
+          <w:rFonts w:ascii="Roboto" w:cs="Roboto" w:eastAsia="Roboto" w:hAnsi="Roboto"/>
+          <w:b w:val="1"/>
+          <w:bCs w:val="1"/>
+          <w:color w:val="172b4d"/>
+          <w:sz w:val="21"/>
+          <w:szCs w:val="21"/>
+        </w:rPr>
+      </w:pPr>
+      <w:r>
+        <w:rPr>
+          <w:rFonts w:ascii="Roboto" w:cs="Roboto" w:eastAsia="Roboto" w:hAnsi="Roboto"/>
+          <w:b w:val="1"/>
+          <w:bCs w:val="1"/>
+          <w:color w:val="172b4d"/>
+          <w:sz w:val="21"/>
+          <w:szCs w:val="21"/>
+          <w:rtl w:val="0"/>
+        </w:rPr>
+        <w:t xml:space="preserve">4.1. Настройка уведомлений</w:t>
+      </w:r>
+    </w:p>
+    <w:p>
+      <w:pPr>
+        <w:pBdr>
+          <w:top w:color="auto" w:space="0" w:sz="0" w:val="none"/>
+          <w:left w:color="auto" w:space="0" w:sz="0" w:val="none"/>
+          <w:bottom w:color="auto" w:space="0" w:sz="0" w:val="none"/>
+          <w:right w:color="auto" w:space="0" w:sz="0" w:val="none"/>
+          <w:between w:color="auto" w:space="0" w:sz="0" w:val="none"/>
+        </w:pBdr>
+        <w:spacing w:before="160" w:lineRule="auto"/>
+        <w:rPr>
+          <w:rFonts w:ascii="Roboto" w:cs="Roboto" w:eastAsia="Roboto" w:hAnsi="Roboto"/>
+          <w:color w:val="172b4d"/>
+          <w:sz w:val="21"/>
+          <w:szCs w:val="21"/>
+        </w:rPr>
+      </w:pPr>
+      <w:r>
+        <w:rPr>
+          <w:rFonts w:ascii="Roboto" w:cs="Roboto" w:eastAsia="Roboto" w:hAnsi="Roboto"/>
+          <w:color w:val="172b4d"/>
+          <w:sz w:val="21"/>
+          <w:szCs w:val="21"/>
+          <w:rtl w:val="0"/>
+        </w:rPr>
+        <w:t xml:space="preserve">4.1.1. Пользователь может настраивать уведомления в профиле.</w:t>
+      </w:r>
+    </w:p>
+    <w:p>
+      <w:pPr>
+        <w:pBdr>
+          <w:top w:color="auto" w:space="0" w:sz="0" w:val="none"/>
+          <w:left w:color="auto" w:space="0" w:sz="0" w:val="none"/>
+          <w:bottom w:color="auto" w:space="0" w:sz="0" w:val="none"/>
+          <w:right w:color="auto" w:space="0" w:sz="0" w:val="none"/>
+          <w:between w:color="auto" w:space="0" w:sz="0" w:val="none"/>
+        </w:pBdr>
+        <w:spacing w:before="160" w:lineRule="auto"/>
+        <w:rPr>
+          <w:rFonts w:ascii="Roboto" w:cs="Roboto" w:eastAsia="Roboto" w:hAnsi="Roboto"/>
+          <w:color w:val="172b4d"/>
+          <w:sz w:val="21"/>
+          <w:szCs w:val="21"/>
+        </w:rPr>
+      </w:pPr>
+      <w:r>
+        <w:rPr>
+          <w:rFonts w:ascii="Roboto" w:cs="Roboto" w:eastAsia="Roboto" w:hAnsi="Roboto"/>
+          <w:color w:val="172b4d"/>
+          <w:sz w:val="21"/>
+          <w:szCs w:val="21"/>
+          <w:rtl w:val="0"/>
+        </w:rPr>
+        <w:t xml:space="preserve">4.1.2. Уведомления приходят на email пользователя.</w:t>
+      </w:r>
+    </w:p>
+    <w:p>
+      <w:pPr>
+        <w:pBdr>
+          <w:top w:color="auto" w:space="0" w:sz="0" w:val="none"/>
+          <w:left w:color="auto" w:space="0" w:sz="0" w:val="none"/>
+          <w:bottom w:color="auto" w:space="0" w:sz="0" w:val="none"/>
+          <w:right w:color="auto" w:space="0" w:sz="0" w:val="none"/>
+          <w:between w:color="auto" w:space="0" w:sz="0" w:val="none"/>
+        </w:pBdr>
+        <w:spacing w:before="160" w:lineRule="auto"/>
+        <w:rPr>
+          <w:rFonts w:ascii="Roboto" w:cs="Roboto" w:eastAsia="Roboto" w:hAnsi="Roboto"/>
+          <w:color w:val="172b4d"/>
+          <w:sz w:val="21"/>
+          <w:szCs w:val="21"/>
+        </w:rPr>
+      </w:pPr>
+      <w:r>
+        <w:rPr>
+          <w:rFonts w:ascii="Roboto" w:cs="Roboto" w:eastAsia="Roboto" w:hAnsi="Roboto"/>
+          <w:color w:val="172b4d"/>
+          <w:sz w:val="21"/>
+          <w:szCs w:val="21"/>
+          <w:rtl w:val="0"/>
+        </w:rPr>
+        <w:t xml:space="preserve">4.1.3. Пользователь может отключить все уведомления.</w:t>
+      </w:r>
+    </w:p>
+    <w:p>
+      <w:pPr>
+        <w:pBdr>
+          <w:top w:color="auto" w:space="0" w:sz="0" w:val="none"/>
+          <w:left w:color="auto" w:space="0" w:sz="0" w:val="none"/>
+          <w:bottom w:color="auto" w:space="0" w:sz="0" w:val="none"/>
+          <w:right w:color="auto" w:space="0" w:sz="0" w:val="none"/>
+          <w:between w:color="auto" w:space="0" w:sz="0" w:val="none"/>
+        </w:pBdr>
+        <w:spacing w:before="160" w:lineRule="auto"/>
+        <w:rPr>
+          <w:rFonts w:ascii="Roboto" w:cs="Roboto" w:eastAsia="Roboto" w:hAnsi="Roboto"/>
+          <w:color w:val="172b4d"/>
+          <w:sz w:val="21"/>
+          <w:szCs w:val="21"/>
+        </w:rPr>
+      </w:pPr>
+      <w:r>
+        <w:rPr>
+          <w:rFonts w:ascii="Roboto" w:cs="Roboto" w:eastAsia="Roboto" w:hAnsi="Roboto"/>
+          <w:color w:val="172b4d"/>
+          <w:sz w:val="21"/>
+          <w:szCs w:val="21"/>
+          <w:rtl w:val="0"/>
+        </w:rPr>
+        <w:t xml:space="preserve">4.1.4. Критические уведомления нельзя отключить.</w:t>
+      </w:r>
+    </w:p>
+    <w:p>
+      <w:pPr>
+        <w:pBdr>
+          <w:top w:color="auto" w:space="0" w:sz="0" w:val="none"/>
+          <w:left w:color="auto" w:space="0" w:sz="0" w:val="none"/>
+          <w:bottom w:color="auto" w:space="0" w:sz="0" w:val="none"/>
+          <w:right w:color="auto" w:space="0" w:sz="0" w:val="none"/>
+          <w:between w:color="auto" w:space="0" w:sz="0" w:val="none"/>
+        </w:pBdr>
+        <w:spacing w:before="160" w:lineRule="auto"/>
+        <w:rPr>
+          <w:rFonts w:ascii="Roboto" w:cs="Roboto" w:eastAsia="Roboto" w:hAnsi="Roboto"/>
+          <w:color w:val="172b4d"/>
+          <w:sz w:val="21"/>
+          <w:szCs w:val="21"/>
+        </w:rPr>
+      </w:pPr>
+      <w:r>
+        <w:rPr>
+          <w:rFonts w:ascii="Roboto" w:cs="Roboto" w:eastAsia="Roboto" w:hAnsi="Roboto"/>
+          <w:color w:val="172b4d"/>
+          <w:sz w:val="21"/>
+          <w:szCs w:val="21"/>
+          <w:rtl w:val="0"/>
+        </w:rPr>
+        <w:t xml:space="preserve">4.1.5. Уведомления о смене статуса задачи являются критическими.</w:t>
+      </w:r>
+    </w:p>
+    <w:p>
+      <w:pPr>
+        <w:pBdr>
+          <w:top w:color="auto" w:space="0" w:sz="0" w:val="none"/>
+          <w:left w:color="auto" w:space="0" w:sz="0" w:val="none"/>
+          <w:bottom w:color="auto" w:space="0" w:sz="0" w:val="none"/>
+          <w:right w:color="auto" w:space="0" w:sz="0" w:val="none"/>
+          <w:between w:color="auto" w:space="0" w:sz="0" w:val="none"/>
+        </w:pBdr>
+        <w:spacing w:before="160" w:lineRule="auto"/>
+        <w:rPr>
+          <w:rFonts w:ascii="Roboto" w:cs="Roboto" w:eastAsia="Roboto" w:hAnsi="Roboto"/>
+          <w:b w:val="1"/>
+          <w:bCs w:val="1"/>
+          <w:color w:val="172b4d"/>
+          <w:sz w:val="21"/>
+          <w:szCs w:val="21"/>
+        </w:rPr>
+      </w:pPr>
+      <w:r>
+        <w:rPr>
+          <w:rFonts w:ascii="Roboto" w:cs="Roboto" w:eastAsia="Roboto" w:hAnsi="Roboto"/>
+          <w:b w:val="1"/>
+          <w:bCs w:val="1"/>
+          <w:color w:val="172b4d"/>
+          <w:sz w:val="21"/>
+          <w:szCs w:val="21"/>
+          <w:rtl w:val="0"/>
+        </w:rPr>
+        <w:t xml:space="preserve">4.2. Доставка уведомлений</w:t>
+      </w:r>
+    </w:p>
+    <w:p>
+      <w:pPr>
+        <w:pBdr>
+          <w:top w:color="auto" w:space="0" w:sz="0" w:val="none"/>
+          <w:left w:color="auto" w:space="0" w:sz="0" w:val="none"/>
+          <w:bottom w:color="auto" w:space="0" w:sz="0" w:val="none"/>
+          <w:right w:color="auto" w:space="0" w:sz="0" w:val="none"/>
+          <w:between w:color="auto" w:space="0" w:sz="0" w:val="none"/>
+        </w:pBdr>
+        <w:spacing w:before="160" w:lineRule="auto"/>
+        <w:rPr>
+          <w:rFonts w:ascii="Roboto" w:cs="Roboto" w:eastAsia="Roboto" w:hAnsi="Roboto"/>
+          <w:color w:val="172b4d"/>
+          <w:sz w:val="21"/>
+          <w:szCs w:val="21"/>
+        </w:rPr>
+      </w:pPr>
+      <w:r>
+        <w:rPr>
+          <w:rFonts w:ascii="Roboto" w:cs="Roboto" w:eastAsia="Roboto" w:hAnsi="Roboto"/>
+          <w:color w:val="172b4d"/>
+          <w:sz w:val="21"/>
+          <w:szCs w:val="21"/>
+          <w:rtl w:val="0"/>
+        </w:rPr>
+        <w:t xml:space="preserve">4.2.1. Уведомления должны доставляться быстро.</w:t>
+      </w:r>
+    </w:p>
+    <w:p>
+      <w:pPr>
+        <w:pBdr>
+          <w:top w:color="auto" w:space="0" w:sz="0" w:val="none"/>
+          <w:left w:color="auto" w:space="0" w:sz="0" w:val="none"/>
+          <w:bottom w:color="auto" w:space="0" w:sz="0" w:val="none"/>
+          <w:right w:color="auto" w:space="0" w:sz="0" w:val="none"/>
+          <w:between w:color="auto" w:space="0" w:sz="0" w:val="none"/>
+        </w:pBdr>
+        <w:spacing w:before="160" w:lineRule="auto"/>
+        <w:rPr>
+          <w:rFonts w:ascii="Roboto" w:cs="Roboto" w:eastAsia="Roboto" w:hAnsi="Roboto"/>
+          <w:color w:val="172b4d"/>
+          <w:sz w:val="21"/>
+          <w:szCs w:val="21"/>
+        </w:rPr>
+      </w:pPr>
+      <w:r>
+        <w:rPr>
+          <w:rFonts w:ascii="Roboto" w:cs="Roboto" w:eastAsia="Roboto" w:hAnsi="Roboto"/>
+          <w:color w:val="172b4d"/>
+          <w:sz w:val="21"/>
+          <w:szCs w:val="21"/>
+          <w:rtl w:val="0"/>
+        </w:rPr>
+        <w:t xml:space="preserve">4.2.2. Если email недоступен, уведомление повторяется через час.</w:t>
+      </w:r>
+    </w:p>
+    <w:p>
+      <w:pPr>
+        <w:pBdr>
+          <w:top w:color="auto" w:space="0" w:sz="0" w:val="none"/>
+          <w:left w:color="auto" w:space="0" w:sz="0" w:val="none"/>
+          <w:bottom w:color="auto" w:space="0" w:sz="0" w:val="none"/>
+          <w:right w:color="auto" w:space="0" w:sz="0" w:val="none"/>
+          <w:between w:color="auto" w:space="0" w:sz="0" w:val="none"/>
+        </w:pBdr>
+        <w:spacing w:before="160" w:lineRule="auto"/>
+        <w:rPr>
+          <w:rFonts w:ascii="Roboto" w:cs="Roboto" w:eastAsia="Roboto" w:hAnsi="Roboto"/>
+          <w:color w:val="172b4d"/>
+          <w:sz w:val="21"/>
+          <w:szCs w:val="21"/>
+        </w:rPr>
+      </w:pPr>
+      <w:r>
+        <w:rPr>
+          <w:rFonts w:ascii="Roboto" w:cs="Roboto" w:eastAsia="Roboto" w:hAnsi="Roboto"/>
+          <w:color w:val="172b4d"/>
+          <w:sz w:val="21"/>
+          <w:szCs w:val="21"/>
+          <w:rtl w:val="0"/>
+        </w:rPr>
+        <w:t xml:space="preserve">4.2.3. Максимальное количество попыток повторной отправки - 3.</w:t>
+      </w:r>
+    </w:p>
+    <w:p>
+      <w:pPr>
+        <w:pBdr>
+          <w:top w:color="auto" w:space="0" w:sz="0" w:val="none"/>
+          <w:left w:color="auto" w:space="0" w:sz="0" w:val="none"/>
+          <w:bottom w:color="auto" w:space="0" w:sz="0" w:val="none"/>
+          <w:right w:color="auto" w:space="0" w:sz="0" w:val="none"/>
+          <w:between w:color="auto" w:space="0" w:sz="0" w:val="none"/>
+        </w:pBdr>
+        <w:spacing w:before="160" w:lineRule="auto"/>
+        <w:rPr>
+          <w:rFonts w:ascii="Roboto" w:cs="Roboto" w:eastAsia="Roboto" w:hAnsi="Roboto"/>
+          <w:color w:val="172b4d"/>
+          <w:sz w:val="21"/>
+          <w:szCs w:val="21"/>
+        </w:rPr>
+      </w:pPr>
+      <w:r>
+        <w:rPr>
+          <w:rFonts w:ascii="Roboto" w:cs="Roboto" w:eastAsia="Roboto" w:hAnsi="Roboto"/>
+          <w:color w:val="172b4d"/>
+          <w:sz w:val="21"/>
+          <w:szCs w:val="21"/>
+          <w:rtl w:val="0"/>
+        </w:rPr>
+        <w:t xml:space="preserve">4.2.4. Уведомление считается доставленным после открытия письма пользователем.</w:t>
+      </w:r>
+    </w:p>
+    <w:p>
+      <w:pPr>
+        <w:pBdr>
+          <w:top w:color="auto" w:space="0" w:sz="0" w:val="none"/>
+          <w:left w:color="auto" w:space="0" w:sz="0" w:val="none"/>
+          <w:bottom w:color="auto" w:space="0" w:sz="0" w:val="none"/>
+          <w:right w:color="auto" w:space="0" w:sz="0" w:val="none"/>
+          <w:between w:color="auto" w:space="0" w:sz="0" w:val="none"/>
+        </w:pBdr>
+        <w:spacing w:before="160" w:lineRule="auto"/>
+        <w:rPr>
+          <w:rFonts w:ascii="Roboto" w:cs="Roboto" w:eastAsia="Roboto" w:hAnsi="Roboto"/>
+          <w:b w:val="1"/>
+          <w:bCs w:val="1"/>
+          <w:color w:val="172b4d"/>
+          <w:sz w:val="21"/>
+          <w:szCs w:val="21"/>
+        </w:rPr>
+      </w:pPr>
+      <w:r>
+        <w:rPr>
+          <w:rFonts w:ascii="Roboto" w:cs="Roboto" w:eastAsia="Roboto" w:hAnsi="Roboto"/>
+          <w:b w:val="1"/>
+          <w:bCs w:val="1"/>
+          <w:color w:val="172b4d"/>
+          <w:sz w:val="21"/>
+          <w:szCs w:val="21"/>
+          <w:rtl w:val="0"/>
+        </w:rPr>
+        <w:t xml:space="preserve">5. Отчётность</w:t>
+      </w:r>
+    </w:p>
+    <w:p>
+      <w:pPr>
+        <w:pBdr>
+          <w:top w:color="auto" w:space="0" w:sz="0" w:val="none"/>
+          <w:left w:color="auto" w:space="0" w:sz="0" w:val="none"/>
+          <w:bottom w:color="auto" w:space="0" w:sz="0" w:val="none"/>
+          <w:right w:color="auto" w:space="0" w:sz="0" w:val="none"/>
+          <w:between w:color="auto" w:space="0" w:sz="0" w:val="none"/>
+        </w:pBdr>
+        <w:spacing w:before="160" w:lineRule="auto"/>
+        <w:rPr>
+          <w:rFonts w:ascii="Roboto" w:cs="Roboto" w:eastAsia="Roboto" w:hAnsi="Roboto"/>
+          <w:b w:val="1"/>
+          <w:bCs w:val="1"/>
+          <w:color w:val="172b4d"/>
+          <w:sz w:val="21"/>
+          <w:szCs w:val="21"/>
+        </w:rPr>
+      </w:pPr>
+      <w:r>
+        <w:rPr>
+          <w:rFonts w:ascii="Roboto" w:cs="Roboto" w:eastAsia="Roboto" w:hAnsi="Roboto"/>
+          <w:b w:val="1"/>
+          <w:bCs w:val="1"/>
+          <w:color w:val="172b4d"/>
+          <w:sz w:val="21"/>
+          <w:szCs w:val="21"/>
+          <w:rtl w:val="0"/>
+        </w:rPr>
+        <w:t xml:space="preserve">5.1. Виды отчётов</w:t>
+      </w:r>
+    </w:p>
+    <w:p>
+      <w:pPr>
+        <w:pBdr>
+          <w:top w:color="auto" w:space="0" w:sz="0" w:val="none"/>
+          <w:left w:color="auto" w:space="0" w:sz="0" w:val="none"/>
+          <w:bottom w:color="auto" w:space="0" w:sz="0" w:val="none"/>
+          <w:right w:color="auto" w:space="0" w:sz="0" w:val="none"/>
+          <w:between w:color="auto" w:space="0" w:sz="0" w:val="none"/>
+        </w:pBdr>
+        <w:spacing w:before="160" w:lineRule="auto"/>
+        <w:rPr>
+          <w:rFonts w:ascii="Roboto" w:cs="Roboto" w:eastAsia="Roboto" w:hAnsi="Roboto"/>
+          <w:color w:val="172b4d"/>
+          <w:sz w:val="21"/>
+          <w:szCs w:val="21"/>
+        </w:rPr>
+      </w:pPr>
+      <w:r>
+        <w:rPr>
+          <w:rFonts w:ascii="Roboto" w:cs="Roboto" w:eastAsia="Roboto" w:hAnsi="Roboto"/>
+          <w:color w:val="172b4d"/>
+          <w:sz w:val="21"/>
+          <w:szCs w:val="21"/>
+          <w:rtl w:val="0"/>
+        </w:rPr>
+        <w:t xml:space="preserve">5.1.1. Менеджер может формировать отчёты по проекту.</w:t>
+      </w:r>
+    </w:p>
+    <w:p>
+      <w:pPr>
+        <w:pBdr>
+          <w:top w:color="auto" w:space="0" w:sz="0" w:val="none"/>
+          <w:left w:color="auto" w:space="0" w:sz="0" w:val="none"/>
+          <w:bottom w:color="auto" w:space="0" w:sz="0" w:val="none"/>
+          <w:right w:color="auto" w:space="0" w:sz="0" w:val="none"/>
+          <w:between w:color="auto" w:space="0" w:sz="0" w:val="none"/>
+        </w:pBdr>
+        <w:spacing w:before="160" w:lineRule="auto"/>
+        <w:rPr>
+          <w:rFonts w:ascii="Roboto" w:cs="Roboto" w:eastAsia="Roboto" w:hAnsi="Roboto"/>
+          <w:color w:val="172b4d"/>
+          <w:sz w:val="21"/>
+          <w:szCs w:val="21"/>
+        </w:rPr>
+      </w:pPr>
+      <w:r>
+        <w:rPr>
+          <w:rFonts w:ascii="Roboto" w:cs="Roboto" w:eastAsia="Roboto" w:hAnsi="Roboto"/>
+          <w:color w:val="172b4d"/>
+          <w:sz w:val="21"/>
+          <w:szCs w:val="21"/>
+          <w:rtl w:val="0"/>
+        </w:rPr>
+        <w:t xml:space="preserve">5.1.2. Отчёт содержит информацию о задачах, сроках и исполнителях.</w:t>
+      </w:r>
+    </w:p>
+    <w:p>
+      <w:pPr>
+        <w:pBdr>
+          <w:top w:color="auto" w:space="0" w:sz="0" w:val="none"/>
+          <w:left w:color="auto" w:space="0" w:sz="0" w:val="none"/>
+          <w:bottom w:color="auto" w:space="0" w:sz="0" w:val="none"/>
+          <w:right w:color="auto" w:space="0" w:sz="0" w:val="none"/>
+          <w:between w:color="auto" w:space="0" w:sz="0" w:val="none"/>
+        </w:pBdr>
+        <w:spacing w:before="160" w:lineRule="auto"/>
+        <w:rPr>
+          <w:rFonts w:ascii="Roboto" w:cs="Roboto" w:eastAsia="Roboto" w:hAnsi="Roboto"/>
+          <w:color w:val="172b4d"/>
+          <w:sz w:val="21"/>
+          <w:szCs w:val="21"/>
+        </w:rPr>
+      </w:pPr>
+      <w:r>
+        <w:rPr>
+          <w:rFonts w:ascii="Roboto" w:cs="Roboto" w:eastAsia="Roboto" w:hAnsi="Roboto"/>
+          <w:color w:val="172b4d"/>
+          <w:sz w:val="21"/>
+          <w:szCs w:val="21"/>
+          <w:rtl w:val="0"/>
+        </w:rPr>
+        <w:t xml:space="preserve">5.1.3. Отчёт можно экспортировать в формате PDF и Excel.</w:t>
+      </w:r>
+    </w:p>
+    <w:p>
+      <w:pPr>
+        <w:pBdr>
+          <w:top w:color="auto" w:space="0" w:sz="0" w:val="none"/>
+          <w:left w:color="auto" w:space="0" w:sz="0" w:val="none"/>
+          <w:bottom w:color="auto" w:space="0" w:sz="0" w:val="none"/>
+          <w:right w:color="auto" w:space="0" w:sz="0" w:val="none"/>
+          <w:between w:color="auto" w:space="0" w:sz="0" w:val="none"/>
+        </w:pBdr>
+        <w:spacing w:before="160" w:lineRule="auto"/>
+        <w:rPr>
+          <w:rFonts w:ascii="Roboto" w:cs="Roboto" w:eastAsia="Roboto" w:hAnsi="Roboto"/>
+          <w:color w:val="172b4d"/>
+          <w:sz w:val="21"/>
+          <w:szCs w:val="21"/>
+        </w:rPr>
+      </w:pPr>
+      <w:r>
+        <w:rPr>
+          <w:rFonts w:ascii="Roboto" w:cs="Roboto" w:eastAsia="Roboto" w:hAnsi="Roboto"/>
+          <w:color w:val="172b4d"/>
+          <w:sz w:val="21"/>
+          <w:szCs w:val="21"/>
+          <w:rtl w:val="0"/>
+        </w:rPr>
+        <w:t xml:space="preserve">5.1.4. Отчёт формируется быстро.</w:t>
+      </w:r>
+    </w:p>
+    <w:p>
+      <w:pPr>
+        <w:pBdr>
+          <w:top w:color="auto" w:space="0" w:sz="0" w:val="none"/>
+          <w:left w:color="auto" w:space="0" w:sz="0" w:val="none"/>
+          <w:bottom w:color="auto" w:space="0" w:sz="0" w:val="none"/>
+          <w:right w:color="auto" w:space="0" w:sz="0" w:val="none"/>
+          <w:between w:color="auto" w:space="0" w:sz="0" w:val="none"/>
+        </w:pBdr>
+        <w:spacing w:before="160" w:lineRule="auto"/>
+        <w:rPr>
+          <w:rFonts w:ascii="Roboto" w:cs="Roboto" w:eastAsia="Roboto" w:hAnsi="Roboto"/>
+          <w:b w:val="1"/>
+          <w:bCs w:val="1"/>
+          <w:color w:val="172b4d"/>
+          <w:sz w:val="21"/>
+          <w:szCs w:val="21"/>
+        </w:rPr>
+      </w:pPr>
+      <w:r>
+        <w:rPr>
+          <w:rFonts w:ascii="Roboto" w:cs="Roboto" w:eastAsia="Roboto" w:hAnsi="Roboto"/>
+          <w:b w:val="1"/>
+          <w:bCs w:val="1"/>
+          <w:color w:val="172b4d"/>
+          <w:sz w:val="21"/>
+          <w:szCs w:val="21"/>
+          <w:rtl w:val="0"/>
+        </w:rPr>
+        <w:t xml:space="preserve">5.2. Доступ к отчётам</w:t>
+      </w:r>
+    </w:p>
+    <w:p>
+      <w:pPr>
+        <w:pBdr>
+          <w:top w:color="auto" w:space="0" w:sz="0" w:val="none"/>
+          <w:left w:color="auto" w:space="0" w:sz="0" w:val="none"/>
+          <w:bottom w:color="auto" w:space="0" w:sz="0" w:val="none"/>
+          <w:right w:color="auto" w:space="0" w:sz="0" w:val="none"/>
+          <w:between w:color="auto" w:space="0" w:sz="0" w:val="none"/>
+        </w:pBdr>
+        <w:spacing w:before="160" w:lineRule="auto"/>
+        <w:rPr>
+          <w:rFonts w:ascii="Roboto" w:cs="Roboto" w:eastAsia="Roboto" w:hAnsi="Roboto"/>
+          <w:color w:val="172b4d"/>
+          <w:sz w:val="21"/>
+          <w:szCs w:val="21"/>
+        </w:rPr>
+      </w:pPr>
+      <w:r>
+        <w:rPr>
+          <w:rFonts w:ascii="Roboto" w:cs="Roboto" w:eastAsia="Roboto" w:hAnsi="Roboto"/>
+          <w:color w:val="172b4d"/>
+          <w:sz w:val="21"/>
+          <w:szCs w:val="21"/>
+          <w:rtl w:val="0"/>
+        </w:rPr>
+        <w:t xml:space="preserve">5.2.1. Отчёты доступны только менеджеру.</w:t>
+      </w:r>
+    </w:p>
+    <w:p>
+      <w:pPr>
+        <w:pBdr>
+          <w:top w:color="auto" w:space="0" w:sz="0" w:val="none"/>
+          <w:left w:color="auto" w:space="0" w:sz="0" w:val="none"/>
+          <w:bottom w:color="auto" w:space="0" w:sz="0" w:val="none"/>
+          <w:right w:color="auto" w:space="0" w:sz="0" w:val="none"/>
+          <w:between w:color="auto" w:space="0" w:sz="0" w:val="none"/>
+        </w:pBdr>
+        <w:spacing w:before="160" w:lineRule="auto"/>
+        <w:rPr>
+          <w:rFonts w:ascii="Roboto" w:cs="Roboto" w:eastAsia="Roboto" w:hAnsi="Roboto"/>
+          <w:color w:val="172b4d"/>
+          <w:sz w:val="21"/>
+          <w:szCs w:val="21"/>
+        </w:rPr>
+      </w:pPr>
+      <w:r>
+        <w:rPr>
+          <w:rFonts w:ascii="Roboto" w:cs="Roboto" w:eastAsia="Roboto" w:hAnsi="Roboto"/>
+          <w:color w:val="172b4d"/>
+          <w:sz w:val="21"/>
+          <w:szCs w:val="21"/>
+          <w:rtl w:val="0"/>
+        </w:rPr>
+        <w:t xml:space="preserve">5.2.2. Администратор имеет доступ ко всем отчётам в системе.</w:t>
+      </w:r>
+    </w:p>
+    <w:p>
+      <w:pPr>
+        <w:pBdr>
+          <w:top w:color="auto" w:space="0" w:sz="0" w:val="none"/>
+          <w:left w:color="auto" w:space="0" w:sz="0" w:val="none"/>
+          <w:bottom w:color="auto" w:space="0" w:sz="0" w:val="none"/>
+          <w:right w:color="auto" w:space="0" w:sz="0" w:val="none"/>
+          <w:between w:color="auto" w:space="0" w:sz="0" w:val="none"/>
+        </w:pBdr>
+        <w:spacing w:before="160" w:lineRule="auto"/>
+        <w:rPr>
+          <w:rFonts w:ascii="Roboto" w:cs="Roboto" w:eastAsia="Roboto" w:hAnsi="Roboto"/>
+          <w:color w:val="172b4d"/>
+          <w:sz w:val="21"/>
+          <w:szCs w:val="21"/>
+        </w:rPr>
+      </w:pPr>
+      <w:r>
+        <w:rPr>
+          <w:rFonts w:ascii="Roboto" w:cs="Roboto" w:eastAsia="Roboto" w:hAnsi="Roboto"/>
+          <w:color w:val="172b4d"/>
+          <w:sz w:val="21"/>
+          <w:szCs w:val="21"/>
+          <w:rtl w:val="0"/>
+        </w:rPr>
+        <w:t xml:space="preserve">5.2.3. Исполнитель может просматривать отчёты по своим задачам.</w:t>
+      </w:r>
+    </w:p>
+    <w:p>
+      <w:pPr>
+        <w:pBdr>
+          <w:top w:color="auto" w:space="0" w:sz="0" w:val="none"/>
+          <w:left w:color="auto" w:space="0" w:sz="0" w:val="none"/>
+          <w:bottom w:color="auto" w:space="0" w:sz="0" w:val="none"/>
+          <w:right w:color="auto" w:space="0" w:sz="0" w:val="none"/>
+          <w:between w:color="auto" w:space="0" w:sz="0" w:val="none"/>
+        </w:pBdr>
+        <w:spacing w:before="160" w:lineRule="auto"/>
+        <w:rPr>
+          <w:rFonts w:ascii="Roboto" w:cs="Roboto" w:eastAsia="Roboto" w:hAnsi="Roboto"/>
+          <w:color w:val="172b4d"/>
+          <w:sz w:val="21"/>
+          <w:szCs w:val="21"/>
+        </w:rPr>
+      </w:pPr>
+      <w:r>
+        <w:rPr>
+          <w:rFonts w:ascii="Roboto" w:cs="Roboto" w:eastAsia="Roboto" w:hAnsi="Roboto"/>
+          <w:color w:val="172b4d"/>
+          <w:sz w:val="21"/>
+          <w:szCs w:val="21"/>
+          <w:rtl w:val="0"/>
+        </w:rPr>
+        <w:t xml:space="preserve">5.2.4. Отчёты хранятся в системе бессрочно.</w:t>
+      </w:r>
     </w:p>
     <w:p>
       <w:pPr>
@@ -2255,7 +4681,131 @@
 </file>
 
 <file path=word/numbering.xml><?xml version="1.0" encoding="utf-8"?>
-<w:numbering xmlns:mc="http://schemas.openxmlformats.org/markup-compatibility/2006" xmlns:o="urn:schemas-microsoft-com:office:office" xmlns:r="http://schemas.openxmlformats.org/officeDocument/2006/relationships" xmlns:m="http://schemas.openxmlformats.org/officeDocument/2006/math" xmlns:v="urn:schemas-microsoft-com:vml" xmlns:wp="http://schemas.openxmlformats.org/drawingml/2006/wordprocessingDrawing" xmlns:w10="urn:schemas-microsoft-com:office:word" xmlns:w="http://schemas.openxmlformats.org/wordprocessingml/2006/main" xmlns:wne="http://schemas.microsoft.com/office/word/2006/wordml" xmlns:sl="http://schemas.openxmlformats.org/schemaLibrary/2006/main" xmlns:a="http://schemas.openxmlformats.org/drawingml/2006/main" xmlns:pic="http://schemas.openxmlformats.org/drawingml/2006/picture" xmlns:c="http://schemas.openxmlformats.org/drawingml/2006/chart" xmlns:lc="http://schemas.openxmlformats.org/drawingml/2006/lockedCanvas" xmlns:dgm="http://schemas.openxmlformats.org/drawingml/2006/diagram" xmlns:wps="http://schemas.microsoft.com/office/word/2010/wordprocessingShape" xmlns:wpg="http://schemas.microsoft.com/office/word/2010/wordprocessingGroup" xmlns:w14="http://schemas.microsoft.com/office/word/2010/wordml" xmlns:w15="http://schemas.microsoft.com/office/word/2012/wordml" xmlns:w16="http://schemas.microsoft.com/office/word/2018/wordml" xmlns:w16cex="http://schemas.microsoft.com/office/word/2018/wordml/cex" xmlns:w16cid="http://schemas.microsoft.com/office/word/2016/wordml/cid" xmlns="http://schemas.microsoft.com/office/tasks/2019/documenttasks" xmlns:cr="http://schemas.microsoft.com/office/comments/2020/reactions"/>
+<w:numbering xmlns:mc="http://schemas.openxmlformats.org/markup-compatibility/2006" xmlns:o="urn:schemas-microsoft-com:office:office" xmlns:r="http://schemas.openxmlformats.org/officeDocument/2006/relationships" xmlns:m="http://schemas.openxmlformats.org/officeDocument/2006/math" xmlns:v="urn:schemas-microsoft-com:vml" xmlns:wp="http://schemas.openxmlformats.org/drawingml/2006/wordprocessingDrawing" xmlns:w10="urn:schemas-microsoft-com:office:word" xmlns:w="http://schemas.openxmlformats.org/wordprocessingml/2006/main" xmlns:wne="http://schemas.microsoft.com/office/word/2006/wordml" xmlns:sl="http://schemas.openxmlformats.org/schemaLibrary/2006/main" xmlns:a="http://schemas.openxmlformats.org/drawingml/2006/main" xmlns:pic="http://schemas.openxmlformats.org/drawingml/2006/picture" xmlns:c="http://schemas.openxmlformats.org/drawingml/2006/chart" xmlns:lc="http://schemas.openxmlformats.org/drawingml/2006/lockedCanvas" xmlns:dgm="http://schemas.openxmlformats.org/drawingml/2006/diagram" xmlns:wps="http://schemas.microsoft.com/office/word/2010/wordprocessingShape" xmlns:wpg="http://schemas.microsoft.com/office/word/2010/wordprocessingGroup" xmlns:w14="http://schemas.microsoft.com/office/word/2010/wordml" xmlns:w15="http://schemas.microsoft.com/office/word/2012/wordml" xmlns:w16="http://schemas.microsoft.com/office/word/2018/wordml" xmlns:w16cex="http://schemas.microsoft.com/office/word/2018/wordml/cex" xmlns:w16cid="http://schemas.microsoft.com/office/word/2016/wordml/cid" xmlns="http://schemas.microsoft.com/office/tasks/2019/documenttasks" xmlns:cr="http://schemas.microsoft.com/office/comments/2020/reactions">
+  <w:abstractNum w:abstractNumId="1">
+    <w:lvl w:ilvl="0">
+      <w:start w:val="1"/>
+      <w:numFmt w:val="bullet"/>
+      <w:lvlText w:val="●"/>
+      <w:lvlJc w:val="left"/>
+      <w:pPr>
+        <w:ind w:left="720" w:hanging="360"/>
+      </w:pPr>
+      <w:rPr>
+        <w:rFonts w:ascii="Roboto" w:cs="Roboto" w:eastAsia="Roboto" w:hAnsi="Roboto"/>
+        <w:b w:val="0"/>
+        <w:bCs w:val="0"/>
+        <w:i w:val="0"/>
+        <w:iCs w:val="0"/>
+        <w:smallCaps w:val="0"/>
+        <w:strike w:val="0"/>
+        <w:color w:val="172b4d"/>
+        <w:sz w:val="21"/>
+        <w:szCs w:val="21"/>
+        <w:u w:val="none"/>
+      </w:rPr>
+    </w:lvl>
+    <w:lvl w:ilvl="1">
+      <w:start w:val="1"/>
+      <w:numFmt w:val="bullet"/>
+      <w:lvlText w:val="○"/>
+      <w:lvlJc w:val="left"/>
+      <w:pPr>
+        <w:ind w:left="1440" w:hanging="360"/>
+      </w:pPr>
+      <w:rPr>
+        <w:u w:val="none"/>
+      </w:rPr>
+    </w:lvl>
+    <w:lvl w:ilvl="2">
+      <w:start w:val="1"/>
+      <w:numFmt w:val="bullet"/>
+      <w:lvlText w:val="■"/>
+      <w:lvlJc w:val="left"/>
+      <w:pPr>
+        <w:ind w:left="2160" w:hanging="360"/>
+      </w:pPr>
+      <w:rPr>
+        <w:u w:val="none"/>
+      </w:rPr>
+    </w:lvl>
+    <w:lvl w:ilvl="3">
+      <w:start w:val="1"/>
+      <w:numFmt w:val="bullet"/>
+      <w:lvlText w:val="●"/>
+      <w:lvlJc w:val="left"/>
+      <w:pPr>
+        <w:ind w:left="2880" w:hanging="360"/>
+      </w:pPr>
+      <w:rPr>
+        <w:u w:val="none"/>
+      </w:rPr>
+    </w:lvl>
+    <w:lvl w:ilvl="4">
+      <w:start w:val="1"/>
+      <w:numFmt w:val="bullet"/>
+      <w:lvlText w:val="○"/>
+      <w:lvlJc w:val="left"/>
+      <w:pPr>
+        <w:ind w:left="3600" w:hanging="360"/>
+      </w:pPr>
+      <w:rPr>
+        <w:u w:val="none"/>
+      </w:rPr>
+    </w:lvl>
+    <w:lvl w:ilvl="5">
+      <w:start w:val="1"/>
+      <w:numFmt w:val="bullet"/>
+      <w:lvlText w:val="■"/>
+      <w:lvlJc w:val="left"/>
+      <w:pPr>
+        <w:ind w:left="4320" w:hanging="360"/>
+      </w:pPr>
+      <w:rPr>
+        <w:u w:val="none"/>
+      </w:rPr>
+    </w:lvl>
+    <w:lvl w:ilvl="6">
+      <w:start w:val="1"/>
+      <w:numFmt w:val="bullet"/>
+      <w:lvlText w:val="●"/>
+      <w:lvlJc w:val="left"/>
+      <w:pPr>
+        <w:ind w:left="5040" w:hanging="360"/>
+      </w:pPr>
+      <w:rPr>
+        <w:u w:val="none"/>
+      </w:rPr>
+    </w:lvl>
+    <w:lvl w:ilvl="7">
+      <w:start w:val="1"/>
+      <w:numFmt w:val="bullet"/>
+      <w:lvlText w:val="○"/>
+      <w:lvlJc w:val="left"/>
+      <w:pPr>
+        <w:ind w:left="5760" w:hanging="360"/>
+      </w:pPr>
+      <w:rPr>
+        <w:u w:val="none"/>
+      </w:rPr>
+    </w:lvl>
+    <w:lvl w:ilvl="8">
+      <w:start w:val="1"/>
+      <w:numFmt w:val="bullet"/>
+      <w:lvlText w:val="■"/>
+      <w:lvlJc w:val="left"/>
+      <w:pPr>
+        <w:ind w:left="6480" w:hanging="360"/>
+      </w:pPr>
+      <w:rPr>
+        <w:u w:val="none"/>
+      </w:rPr>
+    </w:lvl>
+  </w:abstractNum>
+  <w:num w:numId="1">
+    <w:abstractNumId w:val="1"/>
+  </w:num>
+</w:numbering>
 </file>
 
 <file path=word/styles.xml><?xml version="1.0" encoding="utf-8"?>
@@ -2440,6 +4990,14 @@
     </w:tblPr>
   </w:style>
   <w:style w:type="table" w:styleId="Table3">
+    <w:basedOn w:val="TableNormal"/>
+    <w:tblPr>
+      <w:tblStyleRowBandSize w:val="1"/>
+      <w:tblStyleColBandSize w:val="1"/>
+      <w:tblCellMar/>
+    </w:tblPr>
+  </w:style>
+  <w:style w:type="table" w:styleId="Table4">
     <w:basedOn w:val="TableNormal"/>
     <w:tblPr>
       <w:tblStyleRowBandSize w:val="1"/>

</xml_diff>